<commit_message>
Expediente UCuenca: textos cerrados sin cifras inventadas y anexos (hojas de vida y declaraciones)
Co-Authored-By: Claude Opus 5.5 <noreply@anthropic.com>
Claude-Session: https://claude.ai/code/session_012B5UyXLL9ubxzuQGBWyzbg
</commit_message>
<xml_diff>
--- a/curso-obesidad-seda/SEDA_Solicitud_Aval_UCuenca.docx
+++ b/curso-obesidad-seda/SEDA_Solicitud_Aval_UCuenca.docx
@@ -13,16 +13,7 @@
           <w:i w:val="0"/>
           <w:color w:val="1A2325"/>
         </w:rPr>
-        <w:t xml:space="preserve">Cuenca, </w:t>
-      </w:r>
-      <w:r>
-        <w:rPr>
-          <w:b/>
-          <w:i w:val="0"/>
-          <w:color w:val="1A2325"/>
-          <w:highlight w:val="yellow"/>
-        </w:rPr>
-        <w:t>___ de octubre de 2026</w:t>
+        <w:t>Cuenca, ____ de octubre de 2026</w:t>
       </w:r>
     </w:p>
     <w:p>
@@ -800,17 +791,7 @@
                 <w:color w:val="1A2325"/>
                 <w:sz w:val="19"/>
               </w:rPr>
-              <w:t xml:space="preserve">De participación, emitido por SEDA con el aval académico de la Universidad de Cuenca. Se otorga a quienes </w:t>
-            </w:r>
-            <w:r>
-              <w:rPr>
-                <w:b/>
-                <w:i w:val="0"/>
-                <w:color w:val="1A2325"/>
-                <w:sz w:val="19"/>
-                <w:highlight w:val="yellow"/>
-              </w:rPr>
-              <w:t>completen la visualización de las 28 clases en la plataforma — criterio por confirmar</w:t>
+              <w:t>De participación, emitido por SEDA con el aval académico de la Universidad de Cuenca</w:t>
             </w:r>
           </w:p>
         </w:tc>
@@ -887,13 +868,12 @@
             </w:pPr>
             <w:r>
               <w:rPr>
-                <w:b/>
+                <w:b w:val="0"/>
                 <w:i w:val="0"/>
                 <w:color w:val="1A2325"/>
                 <w:sz w:val="19"/>
-                <w:highlight w:val="yellow"/>
               </w:rPr>
-              <w:t>POR DEFINIR — la Comisión de Avales pidió declararlo</w:t>
+              <w:t>El curso contempla un costo de inscripción, cuyo valor fija la directiva de SEDA. Se comunicará a la Comisión antes de abrir las inscripciones</w:t>
             </w:r>
           </w:p>
         </w:tc>
@@ -7038,9 +7018,17 @@
           <w:i w:val="0"/>
           <w:color w:val="1A2325"/>
           <w:sz w:val="18"/>
-          <w:highlight w:val="yellow"/>
         </w:rPr>
-        <w:t>Hojas de vida en trámite: Dr. Frank Espinoza; Dra. Gabriela Machado. Se remitirán a la Comisión en cuanto se reciban.</w:t>
+        <w:t>Hojas de vida en trámite:</w:t>
+      </w:r>
+      <w:r>
+        <w:rPr>
+          <w:b w:val="0"/>
+          <w:i w:val="0"/>
+          <w:color w:val="1A2325"/>
+          <w:sz w:val="18"/>
+        </w:rPr>
+        <w:t xml:space="preserve"> Dr. Frank Espinoza; Dra. Gabriela Machado. Se remitirán a la Comisión en cuanto se reciban.</w:t>
       </w:r>
     </w:p>
     <w:p>
@@ -7069,24 +7057,7 @@
           <w:i w:val="0"/>
           <w:color w:val="1A2325"/>
         </w:rPr>
-        <w:t xml:space="preserve">El curso se financia con el auspicio de la industria farmacéutica y </w:t>
-      </w:r>
-      <w:r>
-        <w:rPr>
-          <w:b/>
-          <w:i w:val="0"/>
-          <w:color w:val="1A2325"/>
-          <w:highlight w:val="yellow"/>
-        </w:rPr>
-        <w:t>con el costo de inscripción — por definir</w:t>
-      </w:r>
-      <w:r>
-        <w:rPr>
-          <w:b w:val="0"/>
-          <w:i w:val="0"/>
-          <w:color w:val="1A2325"/>
-        </w:rPr>
-        <w:t>. El auspicio ingresa a la Sociedad de Endocrinología y Diabetes del Austro, que con esos recursos contrata la plataforma y su gestión operativa.</w:t>
+        <w:t>El curso se financia con el auspicio de la industria farmacéutica y con el costo de inscripción que fije la directiva de la Sociedad. El auspicio ingresa a la Sociedad de Endocrinología y Diabetes del Austro, que con esos recursos contrata la plataforma y su gestión operativa.</w:t>
       </w:r>
     </w:p>
     <w:p>

</xml_diff>

<commit_message>
Isabel Reinoso declina M5 · C2: vuelve a vacante; expediente, desglose y directorio regenerados
Co-Authored-By: Claude Opus 5.5 <noreply@anthropic.com>
Claude-Session: https://claude.ai/code/session_012B5UyXLL9ubxzuQGBWyzbg
</commit_message>
<xml_diff>
--- a/curso-obesidad-seda/SEDA_Solicitud_Aval_UCuenca.docx
+++ b/curso-obesidad-seda/SEDA_Solicitud_Aval_UCuenca.docx
@@ -3324,7 +3324,7 @@
                 <w:color w:val="1A2325"/>
                 <w:sz w:val="17"/>
               </w:rPr>
-              <w:t>Lcda. María Isabel Reinoso Pesántez</w:t>
+              <w:t>Por confirmar</w:t>
             </w:r>
           </w:p>
         </w:tc>
@@ -5515,7 +5515,7 @@
                 <w:color w:val="1A2325"/>
                 <w:sz w:val="17"/>
               </w:rPr>
-              <w:t>M2 · C1 / M5 · C2</w:t>
+              <w:t>M2 · C1</w:t>
             </w:r>
           </w:p>
         </w:tc>
@@ -7019,6 +7019,29 @@
           <w:color w:val="1A2325"/>
           <w:sz w:val="18"/>
         </w:rPr>
+        <w:t>Docente por confirmar:</w:t>
+      </w:r>
+      <w:r>
+        <w:rPr>
+          <w:b w:val="0"/>
+          <w:i w:val="0"/>
+          <w:color w:val="1A2325"/>
+          <w:sz w:val="18"/>
+        </w:rPr>
+        <w:t xml:space="preserve"> M5 · C2. La Sociedad comunicará a la Comisión el nombre y la hoja de vida en cuanto se confirme.</w:t>
+      </w:r>
+    </w:p>
+    <w:p>
+      <w:pPr>
+        <w:spacing w:before="0" w:after="120"/>
+      </w:pPr>
+      <w:r>
+        <w:rPr>
+          <w:b/>
+          <w:i w:val="0"/>
+          <w:color w:val="1A2325"/>
+          <w:sz w:val="18"/>
+        </w:rPr>
         <w:t>Hojas de vida en trámite:</w:t>
       </w:r>
       <w:r>

</xml_diff>

<commit_message>
Dr. Ramón de Cangas acepta M5 · C2: 28 de 28 clases con docente; expediente y anexos regenerados
Co-Authored-By: Claude Opus 5.5 <noreply@anthropic.com>
Claude-Session: https://claude.ai/code/session_012B5UyXLL9ubxzuQGBWyzbg
</commit_message>
<xml_diff>
--- a/curso-obesidad-seda/SEDA_Solicitud_Aval_UCuenca.docx
+++ b/curso-obesidad-seda/SEDA_Solicitud_Aval_UCuenca.docx
@@ -282,7 +282,7 @@
           <w:i w:val="0"/>
           <w:color w:val="1A2325"/>
         </w:rPr>
-        <w:t>, y lo dicta un cuerpo docente de especialistas del Ecuador, México, Costa Rica, Perú, Argentina y Colombia.</w:t>
+        <w:t>, y lo dicta un cuerpo docente de especialistas del Ecuador, México, Costa Rica, Perú, Argentina, Colombia y España.</w:t>
       </w:r>
     </w:p>
     <w:p>
@@ -3324,7 +3324,7 @@
                 <w:color w:val="1A2325"/>
                 <w:sz w:val="17"/>
               </w:rPr>
-              <w:t>Por confirmar</w:t>
+              <w:t>Dr. Ramón de Cangas Morán</w:t>
             </w:r>
           </w:p>
         </w:tc>
@@ -6394,7 +6394,7 @@
                 <w:color w:val="1A2325"/>
                 <w:sz w:val="17"/>
               </w:rPr>
-              <w:t>Dra. Gabriela Machado</w:t>
+              <w:t>Dr. Ramón de Cangas Morán</w:t>
             </w:r>
           </w:p>
         </w:tc>
@@ -6413,7 +6413,7 @@
                 <w:color w:val="1A2325"/>
                 <w:sz w:val="17"/>
               </w:rPr>
-              <w:t>—</w:t>
+              <w:t>Dietista-nutricionista · Biología · Doctor en Biología Funcional y Molecular</w:t>
             </w:r>
           </w:p>
         </w:tc>
@@ -6432,7 +6432,7 @@
                 <w:color w:val="1A2325"/>
                 <w:sz w:val="17"/>
               </w:rPr>
-              <w:t>—</w:t>
+              <w:t>Clínicas Nutrigroup · Fundación Alimenta Tu Salud — Oviedo, España</w:t>
             </w:r>
           </w:p>
         </w:tc>
@@ -6451,7 +6451,7 @@
                 <w:color w:val="1A2325"/>
                 <w:sz w:val="17"/>
               </w:rPr>
-              <w:t>M5 · C3</w:t>
+              <w:t>M5 · C2</w:t>
             </w:r>
           </w:p>
         </w:tc>
@@ -6472,7 +6472,7 @@
                 <w:color w:val="1A2325"/>
                 <w:sz w:val="17"/>
               </w:rPr>
-              <w:t>Dra. Andrea Valeria Andrade Izquierdo</w:t>
+              <w:t>Dra. Gabriela Machado</w:t>
             </w:r>
           </w:p>
         </w:tc>
@@ -6491,7 +6491,7 @@
                 <w:color w:val="1A2325"/>
                 <w:sz w:val="17"/>
               </w:rPr>
-              <w:t>Nefrología · Trasplante renal · PhD en Ciencias, Universidad de São Paulo</w:t>
+              <w:t>—</w:t>
             </w:r>
           </w:p>
         </w:tc>
@@ -6510,7 +6510,7 @@
                 <w:color w:val="1A2325"/>
                 <w:sz w:val="17"/>
               </w:rPr>
-              <w:t>Hospital Santa Inés · Universidad de Cuenca — Cuenca, Ecuador</w:t>
+              <w:t>—</w:t>
             </w:r>
           </w:p>
         </w:tc>
@@ -6529,7 +6529,7 @@
                 <w:color w:val="1A2325"/>
                 <w:sz w:val="17"/>
               </w:rPr>
-              <w:t>M6 · C1</w:t>
+              <w:t>M5 · C3</w:t>
             </w:r>
           </w:p>
         </w:tc>
@@ -6550,7 +6550,7 @@
                 <w:color w:val="1A2325"/>
                 <w:sz w:val="17"/>
               </w:rPr>
-              <w:t>Dr. Chih Hao Chen Ku</w:t>
+              <w:t>Dra. Andrea Valeria Andrade Izquierdo</w:t>
             </w:r>
           </w:p>
         </w:tc>
@@ -6569,7 +6569,7 @@
                 <w:color w:val="1A2325"/>
                 <w:sz w:val="17"/>
               </w:rPr>
-              <w:t>Endocrinología · Farmacología</w:t>
+              <w:t>Nefrología · Trasplante renal · PhD en Ciencias, Universidad de São Paulo</w:t>
             </w:r>
           </w:p>
         </w:tc>
@@ -6588,7 +6588,7 @@
                 <w:color w:val="1A2325"/>
                 <w:sz w:val="17"/>
               </w:rPr>
-              <w:t>Clínica Los Yoses · San José, Costa Rica</w:t>
+              <w:t>Hospital Santa Inés · Universidad de Cuenca — Cuenca, Ecuador</w:t>
             </w:r>
           </w:p>
         </w:tc>
@@ -6607,7 +6607,7 @@
                 <w:color w:val="1A2325"/>
                 <w:sz w:val="17"/>
               </w:rPr>
-              <w:t>M6 · C2 / M6 · C3</w:t>
+              <w:t>M6 · C1</w:t>
             </w:r>
           </w:p>
         </w:tc>
@@ -6628,7 +6628,7 @@
                 <w:color w:val="1A2325"/>
                 <w:sz w:val="17"/>
               </w:rPr>
-              <w:t>Dra. Adriana Mabel Álvarez</w:t>
+              <w:t>Dr. Chih Hao Chen Ku</w:t>
             </w:r>
           </w:p>
         </w:tc>
@@ -6647,7 +6647,7 @@
                 <w:color w:val="1A2325"/>
                 <w:sz w:val="17"/>
               </w:rPr>
-              <w:t>Endocrinología · Comité de Esteatosis Hepática Metabólica · Coordinadora del Grupo Obesidad-MASH de ALAD · Vocal Región Sur de ALAD</w:t>
+              <w:t>Endocrinología · Farmacología</w:t>
             </w:r>
           </w:p>
         </w:tc>
@@ -6666,7 +6666,7 @@
                 <w:color w:val="1A2325"/>
                 <w:sz w:val="17"/>
               </w:rPr>
-              <w:t>Hospital Italiano de Buenos Aires · Buenos Aires, Argentina</w:t>
+              <w:t>Clínica Los Yoses · San José, Costa Rica</w:t>
             </w:r>
           </w:p>
         </w:tc>
@@ -6685,7 +6685,7 @@
                 <w:color w:val="1A2325"/>
                 <w:sz w:val="17"/>
               </w:rPr>
-              <w:t>M6 · C4</w:t>
+              <w:t>M6 · C2 / M6 · C3</w:t>
             </w:r>
           </w:p>
         </w:tc>
@@ -6706,7 +6706,7 @@
                 <w:color w:val="1A2325"/>
                 <w:sz w:val="17"/>
               </w:rPr>
-              <w:t>Dra. Omidres de la Consolación Pérez de Carvelli</w:t>
+              <w:t>Dra. Adriana Mabel Álvarez</w:t>
             </w:r>
           </w:p>
         </w:tc>
@@ -6725,7 +6725,7 @@
                 <w:color w:val="1A2325"/>
                 <w:sz w:val="17"/>
               </w:rPr>
-              <w:t>Medicina Interna · Endocrinología y Metabolismo · Diabetología · Telemedicina y salud digital</w:t>
+              <w:t>Endocrinología · Comité de Esteatosis Hepática Metabólica · Coordinadora del Grupo Obesidad-MASH de ALAD · Vocal Región Sur de ALAD</w:t>
             </w:r>
           </w:p>
         </w:tc>
@@ -6744,7 +6744,7 @@
                 <w:color w:val="1A2325"/>
                 <w:sz w:val="17"/>
               </w:rPr>
-              <w:t>Hospital Universitario del Río — Cuenca, Ecuador</w:t>
+              <w:t>Hospital Italiano de Buenos Aires · Buenos Aires, Argentina</w:t>
             </w:r>
           </w:p>
         </w:tc>
@@ -6763,7 +6763,7 @@
                 <w:color w:val="1A2325"/>
                 <w:sz w:val="17"/>
               </w:rPr>
-              <w:t>M7 · C1</w:t>
+              <w:t>M6 · C4</w:t>
             </w:r>
           </w:p>
         </w:tc>
@@ -6784,7 +6784,7 @@
                 <w:color w:val="1A2325"/>
                 <w:sz w:val="17"/>
               </w:rPr>
-              <w:t>Dra. Ana María Gómez Medina</w:t>
+              <w:t>Dra. Omidres de la Consolación Pérez de Carvelli</w:t>
             </w:r>
           </w:p>
         </w:tc>
@@ -6803,7 +6803,7 @@
                 <w:color w:val="1A2325"/>
                 <w:sz w:val="17"/>
               </w:rPr>
-              <w:t>Medicina Interna · Endocrinología · Tecnología en diabetes</w:t>
+              <w:t>Medicina Interna · Endocrinología y Metabolismo · Diabetología · Telemedicina y salud digital</w:t>
             </w:r>
           </w:p>
         </w:tc>
@@ -6822,7 +6822,7 @@
                 <w:color w:val="1A2325"/>
                 <w:sz w:val="17"/>
               </w:rPr>
-              <w:t>Hospital Universitario San Ignacio · Pontificia Universidad Javeriana — Bogotá, Colombia</w:t>
+              <w:t>Hospital Universitario del Río — Cuenca, Ecuador</w:t>
             </w:r>
           </w:p>
         </w:tc>
@@ -6841,7 +6841,7 @@
                 <w:color w:val="1A2325"/>
                 <w:sz w:val="17"/>
               </w:rPr>
-              <w:t>M7 · C2</w:t>
+              <w:t>M7 · C1</w:t>
             </w:r>
           </w:p>
         </w:tc>
@@ -6862,7 +6862,7 @@
                 <w:color w:val="1A2325"/>
                 <w:sz w:val="17"/>
               </w:rPr>
-              <w:t>Dr. Ronald Fabricio Salas Guerrero</w:t>
+              <w:t>Dra. Ana María Gómez Medina</w:t>
             </w:r>
           </w:p>
         </w:tc>
@@ -6881,7 +6881,7 @@
                 <w:color w:val="1A2325"/>
                 <w:sz w:val="17"/>
               </w:rPr>
-              <w:t>Medicina · Epidemiología · Salud digital e interoperabilidad</w:t>
+              <w:t>Medicina Interna · Endocrinología · Tecnología en diabetes</w:t>
             </w:r>
           </w:p>
         </w:tc>
@@ -6900,7 +6900,7 @@
                 <w:color w:val="1A2325"/>
                 <w:sz w:val="17"/>
               </w:rPr>
-              <w:t>Ministerio de Salud Pública del Ecuador</w:t>
+              <w:t>Hospital Universitario San Ignacio · Pontificia Universidad Javeriana — Bogotá, Colombia</w:t>
             </w:r>
           </w:p>
         </w:tc>
@@ -6919,7 +6919,7 @@
                 <w:color w:val="1A2325"/>
                 <w:sz w:val="17"/>
               </w:rPr>
-              <w:t>M7 · C3</w:t>
+              <w:t>M7 · C2</w:t>
             </w:r>
           </w:p>
         </w:tc>
@@ -6940,7 +6940,7 @@
                 <w:color w:val="1A2325"/>
                 <w:sz w:val="17"/>
               </w:rPr>
-              <w:t>Ing. Styp Bill Roy Canto Rondón</w:t>
+              <w:t>Dr. Ronald Fabricio Salas Guerrero</w:t>
             </w:r>
           </w:p>
         </w:tc>
@@ -6959,7 +6959,7 @@
                 <w:color w:val="1A2325"/>
                 <w:sz w:val="17"/>
               </w:rPr>
-              <w:t>Ingeniería de Telecomunicaciones · TI en salud, telemedicina e interoperabilidad</w:t>
+              <w:t>Medicina · Epidemiología · Salud digital e interoperabilidad</w:t>
             </w:r>
           </w:p>
         </w:tc>
@@ -6978,7 +6978,7 @@
                 <w:color w:val="1A2325"/>
                 <w:sz w:val="17"/>
               </w:rPr>
-              <w:t>Centro Nacional de Telemedicina – EsSalud · Lima, Perú</w:t>
+              <w:t>Ministerio de Salud Pública del Ecuador</w:t>
             </w:r>
           </w:p>
         </w:tc>
@@ -6997,6 +6997,84 @@
                 <w:color w:val="1A2325"/>
                 <w:sz w:val="17"/>
               </w:rPr>
+              <w:t>M7 · C3</w:t>
+            </w:r>
+          </w:p>
+        </w:tc>
+      </w:tr>
+      <w:tr>
+        <w:tc>
+          <w:tcPr>
+            <w:tcW w:type="dxa" w:w="2494"/>
+          </w:tcPr>
+          <w:p>
+            <w:pPr>
+              <w:spacing w:after="0"/>
+            </w:pPr>
+            <w:r>
+              <w:rPr>
+                <w:b w:val="0"/>
+                <w:i w:val="0"/>
+                <w:color w:val="1A2325"/>
+                <w:sz w:val="17"/>
+              </w:rPr>
+              <w:t>Ing. Styp Bill Roy Canto Rondón</w:t>
+            </w:r>
+          </w:p>
+        </w:tc>
+        <w:tc>
+          <w:tcPr>
+            <w:tcW w:type="dxa" w:w="2608"/>
+          </w:tcPr>
+          <w:p>
+            <w:pPr>
+              <w:spacing w:after="0"/>
+            </w:pPr>
+            <w:r>
+              <w:rPr>
+                <w:b w:val="0"/>
+                <w:i w:val="0"/>
+                <w:color w:val="1A2325"/>
+                <w:sz w:val="17"/>
+              </w:rPr>
+              <w:t>Ingeniería de Telecomunicaciones · TI en salud, telemedicina e interoperabilidad</w:t>
+            </w:r>
+          </w:p>
+        </w:tc>
+        <w:tc>
+          <w:tcPr>
+            <w:tcW w:type="dxa" w:w="2835"/>
+          </w:tcPr>
+          <w:p>
+            <w:pPr>
+              <w:spacing w:after="0"/>
+            </w:pPr>
+            <w:r>
+              <w:rPr>
+                <w:b w:val="0"/>
+                <w:i w:val="0"/>
+                <w:color w:val="1A2325"/>
+                <w:sz w:val="17"/>
+              </w:rPr>
+              <w:t>Centro Nacional de Telemedicina – EsSalud · Lima, Perú</w:t>
+            </w:r>
+          </w:p>
+        </w:tc>
+        <w:tc>
+          <w:tcPr>
+            <w:tcW w:type="dxa" w:w="1247"/>
+          </w:tcPr>
+          <w:p>
+            <w:pPr>
+              <w:spacing w:after="0"/>
+            </w:pPr>
+            <w:r>
+              <w:rPr>
+                <w:b w:val="0"/>
+                <w:i w:val="0"/>
+                <w:color w:val="1A2325"/>
+                <w:sz w:val="17"/>
+              </w:rPr>
               <w:t>M7 · C4</w:t>
             </w:r>
           </w:p>
@@ -7007,29 +7085,6 @@
       <w:pPr>
         <w:spacing w:after="40"/>
       </w:pPr>
-    </w:p>
-    <w:p>
-      <w:pPr>
-        <w:spacing w:before="0" w:after="120"/>
-      </w:pPr>
-      <w:r>
-        <w:rPr>
-          <w:b/>
-          <w:i w:val="0"/>
-          <w:color w:val="1A2325"/>
-          <w:sz w:val="18"/>
-        </w:rPr>
-        <w:t>Docente por confirmar:</w:t>
-      </w:r>
-      <w:r>
-        <w:rPr>
-          <w:b w:val="0"/>
-          <w:i w:val="0"/>
-          <w:color w:val="1A2325"/>
-          <w:sz w:val="18"/>
-        </w:rPr>
-        <w:t xml:space="preserve"> M5 · C2. La Sociedad comunicará a la Comisión el nombre y la hoja de vida en cuanto se confirme.</w:t>
-      </w:r>
     </w:p>
     <w:p>
       <w:pPr>
@@ -7220,7 +7275,7 @@
           <w:i w:val="0"/>
           <w:color w:val="1A2325"/>
         </w:rPr>
-        <w:t xml:space="preserve"> Hojas de vida del cuerpo docente (22 de 24).</w:t>
+        <w:t xml:space="preserve"> Hojas de vida del cuerpo docente (23 de 25).</w:t>
       </w:r>
     </w:p>
     <w:p>

</xml_diff>

<commit_message>
Hojas de vida de Astudillo, Castro y Machado archivadas; Cangas sin conflicto; expediente y anexos regenerados
Co-Authored-By: Claude Opus 5.5 <noreply@anthropic.com>
Claude-Session: https://claude.ai/code/session_012B5UyXLL9ubxzuQGBWyzbg
</commit_message>
<xml_diff>
--- a/curso-obesidad-seda/SEDA_Solicitud_Aval_UCuenca.docx
+++ b/curso-obesidad-seda/SEDA_Solicitud_Aval_UCuenca.docx
@@ -3412,7 +3412,7 @@
                 <w:color w:val="1A2325"/>
                 <w:sz w:val="17"/>
               </w:rPr>
-              <w:t>Dra. Gabriela Machado</w:t>
+              <w:t>Dra. María Gabriela Machado Orellana</w:t>
             </w:r>
           </w:p>
         </w:tc>
@@ -5730,7 +5730,7 @@
                 <w:color w:val="1A2325"/>
                 <w:sz w:val="17"/>
               </w:rPr>
-              <w:t>Instituto Ecuatoriano de Seguridad Social — Cuenca, Ecuador</w:t>
+              <w:t>Hospital de Especialidades José Carrasco Arteaga — Cuenca, Ecuador</w:t>
             </w:r>
           </w:p>
         </w:tc>
@@ -6472,7 +6472,7 @@
                 <w:color w:val="1A2325"/>
                 <w:sz w:val="17"/>
               </w:rPr>
-              <w:t>Dra. Gabriela Machado</w:t>
+              <w:t>Dra. María Gabriela Machado Orellana</w:t>
             </w:r>
           </w:p>
         </w:tc>
@@ -6491,7 +6491,7 @@
                 <w:color w:val="1A2325"/>
                 <w:sz w:val="17"/>
               </w:rPr>
-              <w:t>—</w:t>
+              <w:t>Medicina · Nutrición clínica · Máster en Nutrición y Metabolismo</w:t>
             </w:r>
           </w:p>
         </w:tc>
@@ -6510,7 +6510,7 @@
                 <w:color w:val="1A2325"/>
                 <w:sz w:val="17"/>
               </w:rPr>
-              <w:t>—</w:t>
+              <w:t>Consultorios Arupo · docente de la Facultad de Ciencias Médicas, Universidad de Cuenca — Cuenca, Ecuador</w:t>
             </w:r>
           </w:p>
         </w:tc>
@@ -7106,7 +7106,7 @@
           <w:color w:val="1A2325"/>
           <w:sz w:val="18"/>
         </w:rPr>
-        <w:t xml:space="preserve"> Dr. Frank Espinoza; Dra. Gabriela Machado. Se remitirán a la Comisión en cuanto se reciban.</w:t>
+        <w:t xml:space="preserve"> Dr. Frank Espinoza. Se remitirán a la Comisión en cuanto se reciban.</w:t>
       </w:r>
     </w:p>
     <w:p>
@@ -7238,7 +7238,7 @@
           <w:i w:val="0"/>
           <w:color w:val="1A2325"/>
         </w:rPr>
-        <w:t>Los docentes suscriben una declaración de conflicto de interés, que la Sociedad conserva y pone a disposición de la Comisión.</w:t>
+        <w:t>Los docentes declaran sus posibles conflictos de interés. Las declaraciones firmadas recibidas a la fecha se adjuntan como anexo.</w:t>
       </w:r>
     </w:p>
     <w:p>
@@ -7275,7 +7275,7 @@
           <w:i w:val="0"/>
           <w:color w:val="1A2325"/>
         </w:rPr>
-        <w:t xml:space="preserve"> Hojas de vida del cuerpo docente (23 de 25).</w:t>
+        <w:t xml:space="preserve"> Hojas de vida del cuerpo docente (24 de 25).</w:t>
       </w:r>
     </w:p>
     <w:p>

</xml_diff>

<commit_message>
Expediente UCuenca solo con lo que pide la Universidad; borrador del correo a la Comisión
Co-Authored-By: Claude Opus 5.5 <noreply@anthropic.com>
Claude-Session: https://claude.ai/code/session_012B5UyXLL9ubxzuQGBWyzbg
</commit_message>
<xml_diff>
--- a/curso-obesidad-seda/SEDA_Solicitud_Aval_UCuenca.docx
+++ b/curso-obesidad-seda/SEDA_Solicitud_Aval_UCuenca.docx
@@ -832,7 +832,7 @@
                 <w:color w:val="1A2325"/>
                 <w:sz w:val="19"/>
               </w:rPr>
-              <w:t>Boehringer Ingelheim, Laboratorios Elea y Laboratorio Saval (ver sección 7)</w:t>
+              <w:t>Boehringer Ingelheim, Laboratorios Elea y Laboratorio Saval</w:t>
             </w:r>
           </w:p>
         </w:tc>
@@ -874,47 +874,6 @@
                 <w:sz w:val="19"/>
               </w:rPr>
               <w:t>El curso contempla un costo de inscripción, cuyo valor fija la directiva de SEDA. Se comunicará a la Comisión antes de abrir las inscripciones</w:t>
-            </w:r>
-          </w:p>
-        </w:tc>
-      </w:tr>
-      <w:tr>
-        <w:tc>
-          <w:tcPr>
-            <w:tcW w:type="dxa" w:w="2835"/>
-            <w:shd w:val="clear" w:color="auto" w:fill="EDF5F4"/>
-          </w:tcPr>
-          <w:p>
-            <w:pPr>
-              <w:spacing w:after="0"/>
-            </w:pPr>
-            <w:r>
-              <w:rPr>
-                <w:b/>
-                <w:i w:val="0"/>
-                <w:color w:val="1A2325"/>
-                <w:sz w:val="19"/>
-              </w:rPr>
-              <w:t>Coordinación académica</w:t>
-            </w:r>
-          </w:p>
-        </w:tc>
-        <w:tc>
-          <w:tcPr>
-            <w:tcW w:type="dxa" w:w="6350"/>
-          </w:tcPr>
-          <w:p>
-            <w:pPr>
-              <w:spacing w:after="0"/>
-            </w:pPr>
-            <w:r>
-              <w:rPr>
-                <w:b w:val="0"/>
-                <w:i w:val="0"/>
-                <w:color w:val="1A2325"/>
-                <w:sz w:val="19"/>
-              </w:rPr>
-              <w:t>Dra. Omidres Pérez de Carvelli</w:t>
             </w:r>
           </w:p>
         </w:tc>
@@ -5031,7 +4990,7 @@
           <w:i w:val="0"/>
           <w:color w:val="1A2325"/>
         </w:rPr>
-        <w:t>Las hojas de vida se adjuntan como anexo, en el formato propio de cada docente. La participación del cuerpo docente es ad honorem.</w:t>
+        <w:t>Las hojas de vida se adjuntan como anexo, en el formato propio de cada docente.</w:t>
       </w:r>
     </w:p>
     <w:tbl>
@@ -7020,7 +6979,7 @@
           <w:color w:val="0D5A62"/>
           <w:sz w:val="25"/>
         </w:rPr>
-        <w:t>6. Financiamiento</w:t>
+        <w:t>6. Financiamiento y costo al participante</w:t>
       </w:r>
     </w:p>
     <w:p>
@@ -7034,7 +6993,7 @@
           <w:i w:val="0"/>
           <w:color w:val="1A2325"/>
         </w:rPr>
-        <w:t>El curso se financia con el auspicio de la industria farmacéutica y con el costo de inscripción que fije la directiva de la Sociedad. El auspicio ingresa a la Sociedad de Endocrinología y Diabetes del Austro, que con esos recursos contrata la plataforma y su gestión operativa.</w:t>
+        <w:t>El curso se financia con el auspicio de Boehringer Ingelheim, Laboratorios Elea y Laboratorio Saval, y con el costo de inscripción que fije la directiva de la Sociedad, que se comunicará a la Comisión antes de abrir las inscripciones.</w:t>
       </w:r>
     </w:p>
     <w:p>
@@ -7049,110 +7008,7 @@
           <w:color w:val="0D5A62"/>
           <w:sz w:val="25"/>
         </w:rPr>
-        <w:t>7. Auspicio y transparencia</w:t>
-      </w:r>
-    </w:p>
-    <w:p>
-      <w:pPr>
-        <w:spacing w:before="0" w:after="140"/>
-        <w:jc w:val="both"/>
-      </w:pPr>
-      <w:r>
-        <w:rPr>
-          <w:b w:val="0"/>
-          <w:i w:val="0"/>
-          <w:color w:val="1A2325"/>
-        </w:rPr>
-        <w:t xml:space="preserve">El curso cuenta con el auspicio de </w:t>
-      </w:r>
-      <w:r>
-        <w:rPr>
-          <w:b/>
-          <w:i w:val="0"/>
-          <w:color w:val="1A2325"/>
-        </w:rPr>
-        <w:t>Boehringer Ingelheim, Laboratorios Elea y Laboratorio Saval</w:t>
-      </w:r>
-      <w:r>
-        <w:rPr>
-          <w:b w:val="0"/>
-          <w:i w:val="0"/>
-          <w:color w:val="1A2325"/>
-        </w:rPr>
-        <w:t>. Los auspiciantes no intervienen en la selección de docentes, en la definición de los contenidos ni en la elaboración del material, y no revisan las clases antes de su publicación. Los docentes se comprometen a emplear denominaciones genéricas y a no promover marcas comerciales ni productos específicos.</w:t>
-      </w:r>
-    </w:p>
-    <w:p>
-      <w:pPr>
-        <w:spacing w:before="0" w:after="140"/>
-        <w:jc w:val="both"/>
-      </w:pPr>
-      <w:r>
-        <w:rPr>
-          <w:b w:val="0"/>
-          <w:i w:val="0"/>
-          <w:color w:val="1A2325"/>
-        </w:rPr>
-        <w:t xml:space="preserve">El curso se dicta en la plataforma saludelearning.com, operada por </w:t>
-      </w:r>
-      <w:r>
-        <w:rPr>
-          <w:b/>
-          <w:i w:val="0"/>
-          <w:color w:val="1A2325"/>
-        </w:rPr>
-        <w:t>Omisalud Cía. Ltda.</w:t>
-      </w:r>
-      <w:r>
-        <w:rPr>
-          <w:b w:val="0"/>
-          <w:i w:val="0"/>
-          <w:color w:val="1A2325"/>
-        </w:rPr>
-        <w:t xml:space="preserve"> (RUC 0190491641001), compañía de la cual la coordinadora académica, Dra. Omidres Pérez de Carvelli, es socia con el 50 % del capital social y ejerce la Presidencia. La Sociedad contrata el uso de la plataforma y su gestión operativa (montaje del curso, soporte a los participantes, matrículas y certificados) mediante factura emitida por Omisalud Cía. Ltda. y cancelada en su cuenta corporativa nacional. Los auspiciantes no realizan pago alguno a la compañía. La coordinadora académica no participó en la decisión de contratación, que corresponde a la Sociedad.</w:t>
-      </w:r>
-    </w:p>
-    <w:p>
-      <w:pPr>
-        <w:spacing w:before="0" w:after="140"/>
-        <w:jc w:val="both"/>
-      </w:pPr>
-      <w:r>
-        <w:rPr>
-          <w:b w:val="0"/>
-          <w:i w:val="0"/>
-          <w:color w:val="1A2325"/>
-        </w:rPr>
-        <w:t>La participación de todo el cuerpo docente es ad honorem, incluida la de la coordinadora académica, quien no percibe remuneración alguna por la coordinación ni por la docencia. Tiene a su cargo dos clases: «Agonistas del receptor de GLP-1» y «Fundamentos de salud digital y telemedicina en enfermedades crónicas». En la primera, como en todo el curso, se emplean exclusivamente denominaciones genéricas y no se promueve ningún producto comercial.</w:t>
-      </w:r>
-    </w:p>
-    <w:p>
-      <w:pPr>
-        <w:spacing w:before="0" w:after="140"/>
-        <w:jc w:val="both"/>
-      </w:pPr>
-      <w:r>
-        <w:rPr>
-          <w:b w:val="0"/>
-          <w:i w:val="0"/>
-          <w:color w:val="1A2325"/>
-        </w:rPr>
-        <w:t>Los docentes declaran sus posibles conflictos de interés. Las declaraciones firmadas recibidas a la fecha se adjuntan como anexo.</w:t>
-      </w:r>
-    </w:p>
-    <w:p>
-      <w:pPr>
-        <w:keepNext/>
-        <w:spacing w:before="240" w:after="120"/>
-      </w:pPr>
-      <w:r>
-        <w:rPr>
-          <w:b/>
-          <w:i w:val="0"/>
-          <w:color w:val="0D5A62"/>
-          <w:sz w:val="25"/>
-        </w:rPr>
-        <w:t>8. Anexos</w:t>
+        <w:t>7. Anexo</w:t>
       </w:r>
     </w:p>
     <w:p>
@@ -7174,29 +7030,7 @@
           <w:i w:val="0"/>
           <w:color w:val="1A2325"/>
         </w:rPr>
-        <w:t xml:space="preserve"> Hojas de vida del cuerpo docente (24 de 24).</w:t>
-      </w:r>
-    </w:p>
-    <w:p>
-      <w:pPr>
-        <w:pStyle w:val="ListBullet"/>
-        <w:spacing w:after="60"/>
-      </w:pPr>
-      <w:r>
-        <w:rPr>
-          <w:b/>
-          <w:i w:val="0"/>
-          <w:color w:val="1A2325"/>
-        </w:rPr>
-        <w:t>Anexo 2.</w:t>
-      </w:r>
-      <w:r>
-        <w:rPr>
-          <w:b w:val="0"/>
-          <w:i w:val="0"/>
-          <w:color w:val="1A2325"/>
-        </w:rPr>
-        <w:t xml:space="preserve"> Declaraciones de conflicto de interés recibidas a la fecha.</w:t>
+        <w:t xml:space="preserve"> Hojas de vida del cuerpo docente.</w:t>
       </w:r>
     </w:p>
     <w:sectPr>

</xml_diff>

<commit_message>
Carta de solicitud del aval firmada por la Dra. Omidres como Coordinadora docente
Co-Authored-By: Claude Opus 5.5 <noreply@anthropic.com>
Claude-Session: https://claude.ai/code/session_012B5UyXLL9ubxzuQGBWyzbg
</commit_message>
<xml_diff>
--- a/curso-obesidad-seda/SEDA_Solicitud_Aval_UCuenca.docx
+++ b/curso-obesidad-seda/SEDA_Solicitud_Aval_UCuenca.docx
@@ -126,7 +126,7 @@
           <w:i w:val="0"/>
           <w:color w:val="1A2325"/>
         </w:rPr>
-        <w:t xml:space="preserve">Reciba un cordial saludo. En mi calidad de Presidenta de la </w:t>
+        <w:t xml:space="preserve">Reciba un cordial saludo. En mi calidad de Coordinadora docente del curso que organiza la </w:t>
       </w:r>
       <w:r>
         <w:rPr>
@@ -174,7 +174,7 @@
           <w:i w:val="0"/>
           <w:color w:val="1A2325"/>
         </w:rPr>
-        <w:t xml:space="preserve">, que nuestra Sociedad dictará del </w:t>
+        <w:t xml:space="preserve">, que la Sociedad dictará del </w:t>
       </w:r>
       <w:r>
         <w:rPr>
@@ -310,23 +310,7 @@
           <w:i w:val="0"/>
           <w:color w:val="1A2325"/>
         </w:rPr>
-        <w:t xml:space="preserve">Para cualquier aclaración, la coordinación académica del curso está a cargo de la </w:t>
-      </w:r>
-      <w:r>
-        <w:rPr>
-          <w:b/>
-          <w:i w:val="0"/>
-          <w:color w:val="1A2325"/>
-        </w:rPr>
-        <w:t>Dra. Omidres Pérez de Carvelli</w:t>
-      </w:r>
-      <w:r>
-        <w:rPr>
-          <w:b w:val="0"/>
-          <w:i w:val="0"/>
-          <w:color w:val="1A2325"/>
-        </w:rPr>
-        <w:t xml:space="preserve"> (info@draomidresperez.com), quien atenderá con gusto cualquier requerimiento de la Comisión.</w:t>
+        <w:t>Quedo a disposición de la Comisión para cualquier aclaración o requerimiento adicional, en el correo info@draomidresperez.com.</w:t>
       </w:r>
     </w:p>
     <w:p>
@@ -366,7 +350,7 @@
           <w:i w:val="0"/>
           <w:color w:val="1A2325"/>
         </w:rPr>
-        <w:t>Dra. Lizbet Yolanda Ruilova González</w:t>
+        <w:t>Dra. Omidres Pérez de Carvelli</w:t>
       </w:r>
     </w:p>
     <w:p>
@@ -379,7 +363,7 @@
           <w:i w:val="0"/>
           <w:color w:val="1A2325"/>
         </w:rPr>
-        <w:t>Presidenta</w:t>
+        <w:t>Coordinadora docente del curso</w:t>
       </w:r>
     </w:p>
     <w:p>
@@ -6313,7 +6297,7 @@
                 <w:color w:val="1A2325"/>
                 <w:sz w:val="17"/>
               </w:rPr>
-              <w:t>Universidad de Cuenca — Cuenca, Ecuador</w:t>
+              <w:t>Universidad de Cuenca · Universidad Católica de Cuenca · Casa de la Diabetes — Cuenca, Ecuador</w:t>
             </w:r>
           </w:p>
         </w:tc>

</xml_diff>

<commit_message>
Expediente del aval con las fechas del correo del 26/10: 26/11/2026 al 21/01/2027
Co-Authored-By: Claude Opus 5.5 <noreply@anthropic.com>
Claude-Session: https://claude.ai/code/session_012B5UyXLL9ubxzuQGBWyzbg
</commit_message>
<xml_diff>
--- a/curso-obesidad-seda/SEDA_Solicitud_Aval_UCuenca.docx
+++ b/curso-obesidad-seda/SEDA_Solicitud_Aval_UCuenca.docx
@@ -182,7 +182,7 @@
           <w:i w:val="0"/>
           <w:color w:val="1A2325"/>
         </w:rPr>
-        <w:t>5 de noviembre al 17 de diciembre de 2026</w:t>
+        <w:t>26 de noviembre de 2026 al 21 de enero de 2027</w:t>
       </w:r>
       <w:r>
         <w:rPr>
@@ -529,7 +529,7 @@
                 <w:color w:val="1A2325"/>
                 <w:sz w:val="19"/>
               </w:rPr>
-              <w:t>Del jueves 5 de noviembre al jueves 17 de diciembre de 2026 (siete semanas)</w:t>
+              <w:t>Del jueves 26 de noviembre de 2026 al jueves 21 de enero de 2027 (siete jueves, con receso entre el 17 de diciembre y el 7 de enero)</w:t>
             </w:r>
           </w:p>
         </w:tc>
@@ -1084,7 +1084,7 @@
           <w:color w:val="5F7073"/>
           <w:sz w:val="18"/>
         </w:rPr>
-        <w:t>Publicación: jueves 5 de noviembre de 2026</w:t>
+        <w:t>Publicación: jueves 26 de noviembre de 2026</w:t>
       </w:r>
     </w:p>
     <w:tbl>
@@ -1553,1455 +1553,6 @@
           <w:color w:val="0D5A62"/>
         </w:rPr>
         <w:t>Módulo 2 · Nutrición en el manejo de la obesidad</w:t>
-      </w:r>
-    </w:p>
-    <w:p>
-      <w:pPr>
-        <w:keepNext/>
-        <w:spacing w:before="0" w:after="60"/>
-      </w:pPr>
-      <w:r>
-        <w:rPr>
-          <w:b w:val="0"/>
-          <w:i/>
-          <w:color w:val="5F7073"/>
-          <w:sz w:val="18"/>
-        </w:rPr>
-        <w:t>Publicación: jueves 5 de noviembre de 2026</w:t>
-      </w:r>
-    </w:p>
-    <w:tbl>
-      <w:tblPr>
-        <w:tblStyle w:val="TableGrid"/>
-        <w:tblW w:type="auto" w:w="0"/>
-        <w:jc w:val="center"/>
-        <w:tblLayout w:type="fixed"/>
-        <w:tblLook w:firstColumn="1" w:firstRow="1" w:lastColumn="0" w:lastRow="0" w:noHBand="0" w:noVBand="1" w:val="04A0"/>
-      </w:tblPr>
-      <w:tblGrid>
-        <w:gridCol w:w="907"/>
-        <w:gridCol w:w="4876"/>
-        <w:gridCol w:w="2494"/>
-        <w:gridCol w:w="907"/>
-      </w:tblGrid>
-      <w:tr>
-        <w:tc>
-          <w:tcPr>
-            <w:tcW w:type="dxa" w:w="907"/>
-            <w:shd w:val="clear" w:color="auto" w:fill="0D5A62"/>
-          </w:tcPr>
-          <w:p>
-            <w:pPr>
-              <w:spacing w:after="0"/>
-            </w:pPr>
-            <w:r>
-              <w:rPr>
-                <w:b/>
-                <w:i w:val="0"/>
-                <w:color w:val="FFFFFF"/>
-                <w:sz w:val="17"/>
-              </w:rPr>
-              <w:t>Clase</w:t>
-            </w:r>
-          </w:p>
-        </w:tc>
-        <w:tc>
-          <w:tcPr>
-            <w:tcW w:type="dxa" w:w="4876"/>
-            <w:shd w:val="clear" w:color="auto" w:fill="0D5A62"/>
-          </w:tcPr>
-          <w:p>
-            <w:pPr>
-              <w:spacing w:after="0"/>
-            </w:pPr>
-            <w:r>
-              <w:rPr>
-                <w:b/>
-                <w:i w:val="0"/>
-                <w:color w:val="FFFFFF"/>
-                <w:sz w:val="17"/>
-              </w:rPr>
-              <w:t>Tema y contenidos</w:t>
-            </w:r>
-          </w:p>
-        </w:tc>
-        <w:tc>
-          <w:tcPr>
-            <w:tcW w:type="dxa" w:w="2494"/>
-            <w:shd w:val="clear" w:color="auto" w:fill="0D5A62"/>
-          </w:tcPr>
-          <w:p>
-            <w:pPr>
-              <w:spacing w:after="0"/>
-            </w:pPr>
-            <w:r>
-              <w:rPr>
-                <w:b/>
-                <w:i w:val="0"/>
-                <w:color w:val="FFFFFF"/>
-                <w:sz w:val="17"/>
-              </w:rPr>
-              <w:t>Expositor</w:t>
-            </w:r>
-          </w:p>
-        </w:tc>
-        <w:tc>
-          <w:tcPr>
-            <w:tcW w:type="dxa" w:w="907"/>
-            <w:shd w:val="clear" w:color="auto" w:fill="0D5A62"/>
-          </w:tcPr>
-          <w:p>
-            <w:pPr>
-              <w:spacing w:after="0"/>
-            </w:pPr>
-            <w:r>
-              <w:rPr>
-                <w:b/>
-                <w:i w:val="0"/>
-                <w:color w:val="FFFFFF"/>
-                <w:sz w:val="17"/>
-              </w:rPr>
-              <w:t>Duración</w:t>
-            </w:r>
-          </w:p>
-        </w:tc>
-      </w:tr>
-      <w:tr>
-        <w:tc>
-          <w:tcPr>
-            <w:tcW w:type="dxa" w:w="907"/>
-          </w:tcPr>
-          <w:p>
-            <w:pPr>
-              <w:spacing w:after="0"/>
-            </w:pPr>
-            <w:r>
-              <w:rPr>
-                <w:b w:val="0"/>
-                <w:i w:val="0"/>
-                <w:color w:val="1A2325"/>
-                <w:sz w:val="17"/>
-              </w:rPr>
-              <w:t>M2 · C1</w:t>
-            </w:r>
-          </w:p>
-        </w:tc>
-        <w:tc>
-          <w:tcPr>
-            <w:tcW w:type="dxa" w:w="4876"/>
-          </w:tcPr>
-          <w:p>
-            <w:pPr>
-              <w:spacing w:after="0"/>
-            </w:pPr>
-            <w:r>
-              <w:rPr>
-                <w:b/>
-                <w:i w:val="0"/>
-                <w:color w:val="1A2325"/>
-                <w:sz w:val="17"/>
-              </w:rPr>
-              <w:t>Principios de terapia nutricional</w:t>
-            </w:r>
-            <w:r>
-              <w:rPr>
-                <w:b w:val="0"/>
-                <w:i w:val="0"/>
-                <w:color w:val="1A2325"/>
-                <w:sz w:val="17"/>
-              </w:rPr>
-              <w:br/>
-              <w:t>Balance energético; calidad nutricional; individualización del tratamiento</w:t>
-            </w:r>
-          </w:p>
-        </w:tc>
-        <w:tc>
-          <w:tcPr>
-            <w:tcW w:type="dxa" w:w="2494"/>
-          </w:tcPr>
-          <w:p>
-            <w:pPr>
-              <w:spacing w:after="0"/>
-            </w:pPr>
-            <w:r>
-              <w:rPr>
-                <w:b w:val="0"/>
-                <w:i w:val="0"/>
-                <w:color w:val="1A2325"/>
-                <w:sz w:val="17"/>
-              </w:rPr>
-              <w:t>Lcda. María Isabel Reinoso Pesántez</w:t>
-            </w:r>
-          </w:p>
-        </w:tc>
-        <w:tc>
-          <w:tcPr>
-            <w:tcW w:type="dxa" w:w="907"/>
-          </w:tcPr>
-          <w:p>
-            <w:pPr>
-              <w:spacing w:after="0"/>
-            </w:pPr>
-            <w:r>
-              <w:rPr>
-                <w:b w:val="0"/>
-                <w:i w:val="0"/>
-                <w:color w:val="1A2325"/>
-                <w:sz w:val="17"/>
-              </w:rPr>
-              <w:t>30 min</w:t>
-            </w:r>
-          </w:p>
-        </w:tc>
-      </w:tr>
-      <w:tr>
-        <w:tc>
-          <w:tcPr>
-            <w:tcW w:type="dxa" w:w="907"/>
-          </w:tcPr>
-          <w:p>
-            <w:pPr>
-              <w:spacing w:after="0"/>
-            </w:pPr>
-            <w:r>
-              <w:rPr>
-                <w:b w:val="0"/>
-                <w:i w:val="0"/>
-                <w:color w:val="1A2325"/>
-                <w:sz w:val="17"/>
-              </w:rPr>
-              <w:t>M2 · C2</w:t>
-            </w:r>
-          </w:p>
-        </w:tc>
-        <w:tc>
-          <w:tcPr>
-            <w:tcW w:type="dxa" w:w="4876"/>
-          </w:tcPr>
-          <w:p>
-            <w:pPr>
-              <w:spacing w:after="0"/>
-            </w:pPr>
-            <w:r>
-              <w:rPr>
-                <w:b/>
-                <w:i w:val="0"/>
-                <w:color w:val="1A2325"/>
-                <w:sz w:val="17"/>
-              </w:rPr>
-              <w:t>Patrones alimentarios basados en evidencia</w:t>
-            </w:r>
-            <w:r>
-              <w:rPr>
-                <w:b w:val="0"/>
-                <w:i w:val="0"/>
-                <w:color w:val="1A2325"/>
-                <w:sz w:val="17"/>
-              </w:rPr>
-              <w:br/>
-              <w:t>Dieta mediterránea; dieta DASH; dietas bajas en carbohidratos; ayuno intermitente</w:t>
-            </w:r>
-          </w:p>
-        </w:tc>
-        <w:tc>
-          <w:tcPr>
-            <w:tcW w:type="dxa" w:w="2494"/>
-          </w:tcPr>
-          <w:p>
-            <w:pPr>
-              <w:spacing w:after="0"/>
-            </w:pPr>
-            <w:r>
-              <w:rPr>
-                <w:b w:val="0"/>
-                <w:i w:val="0"/>
-                <w:color w:val="1A2325"/>
-                <w:sz w:val="17"/>
-              </w:rPr>
-              <w:t>Dra. Johanna Piedra Bravo</w:t>
-            </w:r>
-          </w:p>
-        </w:tc>
-        <w:tc>
-          <w:tcPr>
-            <w:tcW w:type="dxa" w:w="907"/>
-          </w:tcPr>
-          <w:p>
-            <w:pPr>
-              <w:spacing w:after="0"/>
-            </w:pPr>
-            <w:r>
-              <w:rPr>
-                <w:b w:val="0"/>
-                <w:i w:val="0"/>
-                <w:color w:val="1A2325"/>
-                <w:sz w:val="17"/>
-              </w:rPr>
-              <w:t>30 min</w:t>
-            </w:r>
-          </w:p>
-        </w:tc>
-      </w:tr>
-      <w:tr>
-        <w:tc>
-          <w:tcPr>
-            <w:tcW w:type="dxa" w:w="907"/>
-          </w:tcPr>
-          <w:p>
-            <w:pPr>
-              <w:spacing w:after="0"/>
-            </w:pPr>
-            <w:r>
-              <w:rPr>
-                <w:b w:val="0"/>
-                <w:i w:val="0"/>
-                <w:color w:val="1A2325"/>
-                <w:sz w:val="17"/>
-              </w:rPr>
-              <w:t>M2 · C3</w:t>
-            </w:r>
-          </w:p>
-        </w:tc>
-        <w:tc>
-          <w:tcPr>
-            <w:tcW w:type="dxa" w:w="4876"/>
-          </w:tcPr>
-          <w:p>
-            <w:pPr>
-              <w:spacing w:after="0"/>
-            </w:pPr>
-            <w:r>
-              <w:rPr>
-                <w:b/>
-                <w:i w:val="0"/>
-                <w:color w:val="1A2325"/>
-                <w:sz w:val="17"/>
-              </w:rPr>
-              <w:t>Nutrición conductual</w:t>
-            </w:r>
-            <w:r>
-              <w:rPr>
-                <w:b w:val="0"/>
-                <w:i w:val="0"/>
-                <w:color w:val="1A2325"/>
-                <w:sz w:val="17"/>
-              </w:rPr>
-              <w:br/>
-              <w:t>Hambre fisiológica y emocional; conducta alimentaria; adherencia terapéutica</w:t>
-            </w:r>
-          </w:p>
-        </w:tc>
-        <w:tc>
-          <w:tcPr>
-            <w:tcW w:type="dxa" w:w="2494"/>
-          </w:tcPr>
-          <w:p>
-            <w:pPr>
-              <w:spacing w:after="0"/>
-            </w:pPr>
-            <w:r>
-              <w:rPr>
-                <w:b w:val="0"/>
-                <w:i w:val="0"/>
-                <w:color w:val="1A2325"/>
-                <w:sz w:val="17"/>
-              </w:rPr>
-              <w:t>Dra. Marcia Janneth Bermeo Cabrera</w:t>
-            </w:r>
-          </w:p>
-        </w:tc>
-        <w:tc>
-          <w:tcPr>
-            <w:tcW w:type="dxa" w:w="907"/>
-          </w:tcPr>
-          <w:p>
-            <w:pPr>
-              <w:spacing w:after="0"/>
-            </w:pPr>
-            <w:r>
-              <w:rPr>
-                <w:b w:val="0"/>
-                <w:i w:val="0"/>
-                <w:color w:val="1A2325"/>
-                <w:sz w:val="17"/>
-              </w:rPr>
-              <w:t>30 min</w:t>
-            </w:r>
-          </w:p>
-        </w:tc>
-      </w:tr>
-      <w:tr>
-        <w:tc>
-          <w:tcPr>
-            <w:tcW w:type="dxa" w:w="907"/>
-          </w:tcPr>
-          <w:p>
-            <w:pPr>
-              <w:spacing w:after="0"/>
-            </w:pPr>
-            <w:r>
-              <w:rPr>
-                <w:b w:val="0"/>
-                <w:i w:val="0"/>
-                <w:color w:val="1A2325"/>
-                <w:sz w:val="17"/>
-              </w:rPr>
-              <w:t>M2 · C4</w:t>
-            </w:r>
-          </w:p>
-        </w:tc>
-        <w:tc>
-          <w:tcPr>
-            <w:tcW w:type="dxa" w:w="4876"/>
-          </w:tcPr>
-          <w:p>
-            <w:pPr>
-              <w:spacing w:after="0"/>
-            </w:pPr>
-            <w:r>
-              <w:rPr>
-                <w:b/>
-                <w:i w:val="0"/>
-                <w:color w:val="1A2325"/>
-                <w:sz w:val="17"/>
-              </w:rPr>
-              <w:t>Actividad física en obesidad</w:t>
-            </w:r>
-            <w:r>
-              <w:rPr>
-                <w:b w:val="0"/>
-                <w:i w:val="0"/>
-                <w:color w:val="1A2325"/>
-                <w:sz w:val="17"/>
-              </w:rPr>
-              <w:br/>
-              <w:t>Ejercicio aeróbico; entrenamiento de fuerza; prescripción de ejercicio</w:t>
-            </w:r>
-          </w:p>
-        </w:tc>
-        <w:tc>
-          <w:tcPr>
-            <w:tcW w:type="dxa" w:w="2494"/>
-          </w:tcPr>
-          <w:p>
-            <w:pPr>
-              <w:spacing w:after="0"/>
-            </w:pPr>
-            <w:r>
-              <w:rPr>
-                <w:b w:val="0"/>
-                <w:i w:val="0"/>
-                <w:color w:val="1A2325"/>
-                <w:sz w:val="17"/>
-              </w:rPr>
-              <w:t>Dra. Julia Castro de González</w:t>
-            </w:r>
-          </w:p>
-        </w:tc>
-        <w:tc>
-          <w:tcPr>
-            <w:tcW w:type="dxa" w:w="907"/>
-          </w:tcPr>
-          <w:p>
-            <w:pPr>
-              <w:spacing w:after="0"/>
-            </w:pPr>
-            <w:r>
-              <w:rPr>
-                <w:b w:val="0"/>
-                <w:i w:val="0"/>
-                <w:color w:val="1A2325"/>
-                <w:sz w:val="17"/>
-              </w:rPr>
-              <w:t>30 min</w:t>
-            </w:r>
-          </w:p>
-        </w:tc>
-      </w:tr>
-    </w:tbl>
-    <w:p>
-      <w:pPr>
-        <w:spacing w:after="40"/>
-      </w:pPr>
-    </w:p>
-    <w:p>
-      <w:pPr>
-        <w:keepNext/>
-        <w:spacing w:before="120" w:after="40"/>
-      </w:pPr>
-      <w:r>
-        <w:rPr>
-          <w:b/>
-          <w:i w:val="0"/>
-          <w:color w:val="0D5A62"/>
-        </w:rPr>
-        <w:t>Módulo 3 · Tratamiento farmacológico y cirugía de la obesidad</w:t>
-      </w:r>
-    </w:p>
-    <w:p>
-      <w:pPr>
-        <w:keepNext/>
-        <w:spacing w:before="0" w:after="60"/>
-      </w:pPr>
-      <w:r>
-        <w:rPr>
-          <w:b w:val="0"/>
-          <w:i/>
-          <w:color w:val="5F7073"/>
-          <w:sz w:val="18"/>
-        </w:rPr>
-        <w:t>Publicación: jueves 12 de noviembre de 2026</w:t>
-      </w:r>
-    </w:p>
-    <w:tbl>
-      <w:tblPr>
-        <w:tblStyle w:val="TableGrid"/>
-        <w:tblW w:type="auto" w:w="0"/>
-        <w:jc w:val="center"/>
-        <w:tblLayout w:type="fixed"/>
-        <w:tblLook w:firstColumn="1" w:firstRow="1" w:lastColumn="0" w:lastRow="0" w:noHBand="0" w:noVBand="1" w:val="04A0"/>
-      </w:tblPr>
-      <w:tblGrid>
-        <w:gridCol w:w="907"/>
-        <w:gridCol w:w="4876"/>
-        <w:gridCol w:w="2494"/>
-        <w:gridCol w:w="907"/>
-      </w:tblGrid>
-      <w:tr>
-        <w:tc>
-          <w:tcPr>
-            <w:tcW w:type="dxa" w:w="907"/>
-            <w:shd w:val="clear" w:color="auto" w:fill="0D5A62"/>
-          </w:tcPr>
-          <w:p>
-            <w:pPr>
-              <w:spacing w:after="0"/>
-            </w:pPr>
-            <w:r>
-              <w:rPr>
-                <w:b/>
-                <w:i w:val="0"/>
-                <w:color w:val="FFFFFF"/>
-                <w:sz w:val="17"/>
-              </w:rPr>
-              <w:t>Clase</w:t>
-            </w:r>
-          </w:p>
-        </w:tc>
-        <w:tc>
-          <w:tcPr>
-            <w:tcW w:type="dxa" w:w="4876"/>
-            <w:shd w:val="clear" w:color="auto" w:fill="0D5A62"/>
-          </w:tcPr>
-          <w:p>
-            <w:pPr>
-              <w:spacing w:after="0"/>
-            </w:pPr>
-            <w:r>
-              <w:rPr>
-                <w:b/>
-                <w:i w:val="0"/>
-                <w:color w:val="FFFFFF"/>
-                <w:sz w:val="17"/>
-              </w:rPr>
-              <w:t>Tema y contenidos</w:t>
-            </w:r>
-          </w:p>
-        </w:tc>
-        <w:tc>
-          <w:tcPr>
-            <w:tcW w:type="dxa" w:w="2494"/>
-            <w:shd w:val="clear" w:color="auto" w:fill="0D5A62"/>
-          </w:tcPr>
-          <w:p>
-            <w:pPr>
-              <w:spacing w:after="0"/>
-            </w:pPr>
-            <w:r>
-              <w:rPr>
-                <w:b/>
-                <w:i w:val="0"/>
-                <w:color w:val="FFFFFF"/>
-                <w:sz w:val="17"/>
-              </w:rPr>
-              <w:t>Expositor</w:t>
-            </w:r>
-          </w:p>
-        </w:tc>
-        <w:tc>
-          <w:tcPr>
-            <w:tcW w:type="dxa" w:w="907"/>
-            <w:shd w:val="clear" w:color="auto" w:fill="0D5A62"/>
-          </w:tcPr>
-          <w:p>
-            <w:pPr>
-              <w:spacing w:after="0"/>
-            </w:pPr>
-            <w:r>
-              <w:rPr>
-                <w:b/>
-                <w:i w:val="0"/>
-                <w:color w:val="FFFFFF"/>
-                <w:sz w:val="17"/>
-              </w:rPr>
-              <w:t>Duración</w:t>
-            </w:r>
-          </w:p>
-        </w:tc>
-      </w:tr>
-      <w:tr>
-        <w:tc>
-          <w:tcPr>
-            <w:tcW w:type="dxa" w:w="907"/>
-          </w:tcPr>
-          <w:p>
-            <w:pPr>
-              <w:spacing w:after="0"/>
-            </w:pPr>
-            <w:r>
-              <w:rPr>
-                <w:b w:val="0"/>
-                <w:i w:val="0"/>
-                <w:color w:val="1A2325"/>
-                <w:sz w:val="17"/>
-              </w:rPr>
-              <w:t>M3 · C1</w:t>
-            </w:r>
-          </w:p>
-        </w:tc>
-        <w:tc>
-          <w:tcPr>
-            <w:tcW w:type="dxa" w:w="4876"/>
-          </w:tcPr>
-          <w:p>
-            <w:pPr>
-              <w:spacing w:after="0"/>
-            </w:pPr>
-            <w:r>
-              <w:rPr>
-                <w:b/>
-                <w:i w:val="0"/>
-                <w:color w:val="1A2325"/>
-                <w:sz w:val="17"/>
-              </w:rPr>
-              <w:t>Farmacoterapia para obesidad</w:t>
-            </w:r>
-            <w:r>
-              <w:rPr>
-                <w:b w:val="0"/>
-                <w:i w:val="0"/>
-                <w:color w:val="1A2325"/>
-                <w:sz w:val="17"/>
-              </w:rPr>
-              <w:br/>
-              <w:t>Indicaciones generales; orlistat; fentermina; fentermina/topiramato; bupropión/naltrexona</w:t>
-            </w:r>
-          </w:p>
-        </w:tc>
-        <w:tc>
-          <w:tcPr>
-            <w:tcW w:type="dxa" w:w="2494"/>
-          </w:tcPr>
-          <w:p>
-            <w:pPr>
-              <w:spacing w:after="0"/>
-            </w:pPr>
-            <w:r>
-              <w:rPr>
-                <w:b w:val="0"/>
-                <w:i w:val="0"/>
-                <w:color w:val="1A2325"/>
-                <w:sz w:val="17"/>
-              </w:rPr>
-              <w:t>Dr. Pablo Esteban Vanegas Cedillo</w:t>
-            </w:r>
-          </w:p>
-        </w:tc>
-        <w:tc>
-          <w:tcPr>
-            <w:tcW w:type="dxa" w:w="907"/>
-          </w:tcPr>
-          <w:p>
-            <w:pPr>
-              <w:spacing w:after="0"/>
-            </w:pPr>
-            <w:r>
-              <w:rPr>
-                <w:b w:val="0"/>
-                <w:i w:val="0"/>
-                <w:color w:val="1A2325"/>
-                <w:sz w:val="17"/>
-              </w:rPr>
-              <w:t>30 min</w:t>
-            </w:r>
-          </w:p>
-        </w:tc>
-      </w:tr>
-      <w:tr>
-        <w:tc>
-          <w:tcPr>
-            <w:tcW w:type="dxa" w:w="907"/>
-          </w:tcPr>
-          <w:p>
-            <w:pPr>
-              <w:spacing w:after="0"/>
-            </w:pPr>
-            <w:r>
-              <w:rPr>
-                <w:b w:val="0"/>
-                <w:i w:val="0"/>
-                <w:color w:val="1A2325"/>
-                <w:sz w:val="17"/>
-              </w:rPr>
-              <w:t>M3 · C2</w:t>
-            </w:r>
-          </w:p>
-        </w:tc>
-        <w:tc>
-          <w:tcPr>
-            <w:tcW w:type="dxa" w:w="4876"/>
-          </w:tcPr>
-          <w:p>
-            <w:pPr>
-              <w:spacing w:after="0"/>
-            </w:pPr>
-            <w:r>
-              <w:rPr>
-                <w:b/>
-                <w:i w:val="0"/>
-                <w:color w:val="1A2325"/>
-                <w:sz w:val="17"/>
-              </w:rPr>
-              <w:t>Agonistas del receptor de GLP-1</w:t>
-            </w:r>
-            <w:r>
-              <w:rPr>
-                <w:b w:val="0"/>
-                <w:i w:val="0"/>
-                <w:color w:val="1A2325"/>
-                <w:sz w:val="17"/>
-              </w:rPr>
-              <w:br/>
-              <w:t>Semaglutida; evidencia clínica</w:t>
-            </w:r>
-          </w:p>
-        </w:tc>
-        <w:tc>
-          <w:tcPr>
-            <w:tcW w:type="dxa" w:w="2494"/>
-          </w:tcPr>
-          <w:p>
-            <w:pPr>
-              <w:spacing w:after="0"/>
-            </w:pPr>
-            <w:r>
-              <w:rPr>
-                <w:b w:val="0"/>
-                <w:i w:val="0"/>
-                <w:color w:val="1A2325"/>
-                <w:sz w:val="17"/>
-              </w:rPr>
-              <w:t>Dra. Omidres de la Consolación Pérez de Carvelli</w:t>
-            </w:r>
-          </w:p>
-        </w:tc>
-        <w:tc>
-          <w:tcPr>
-            <w:tcW w:type="dxa" w:w="907"/>
-          </w:tcPr>
-          <w:p>
-            <w:pPr>
-              <w:spacing w:after="0"/>
-            </w:pPr>
-            <w:r>
-              <w:rPr>
-                <w:b w:val="0"/>
-                <w:i w:val="0"/>
-                <w:color w:val="1A2325"/>
-                <w:sz w:val="17"/>
-              </w:rPr>
-              <w:t>30 min</w:t>
-            </w:r>
-          </w:p>
-        </w:tc>
-      </w:tr>
-      <w:tr>
-        <w:tc>
-          <w:tcPr>
-            <w:tcW w:type="dxa" w:w="907"/>
-          </w:tcPr>
-          <w:p>
-            <w:pPr>
-              <w:spacing w:after="0"/>
-            </w:pPr>
-            <w:r>
-              <w:rPr>
-                <w:b w:val="0"/>
-                <w:i w:val="0"/>
-                <w:color w:val="1A2325"/>
-                <w:sz w:val="17"/>
-              </w:rPr>
-              <w:t>M3 · C3</w:t>
-            </w:r>
-          </w:p>
-        </w:tc>
-        <w:tc>
-          <w:tcPr>
-            <w:tcW w:type="dxa" w:w="4876"/>
-          </w:tcPr>
-          <w:p>
-            <w:pPr>
-              <w:spacing w:after="0"/>
-            </w:pPr>
-            <w:r>
-              <w:rPr>
-                <w:b/>
-                <w:i w:val="0"/>
-                <w:color w:val="1A2325"/>
-                <w:sz w:val="17"/>
-              </w:rPr>
-              <w:t>Tirzepatida y nuevas terapias</w:t>
-            </w:r>
-            <w:r>
-              <w:rPr>
-                <w:b w:val="0"/>
-                <w:i w:val="0"/>
-                <w:color w:val="1A2325"/>
-                <w:sz w:val="17"/>
-              </w:rPr>
-              <w:br/>
-              <w:t>Mecanismos de acción; evidencia clínica; seguridad</w:t>
-            </w:r>
-          </w:p>
-        </w:tc>
-        <w:tc>
-          <w:tcPr>
-            <w:tcW w:type="dxa" w:w="2494"/>
-          </w:tcPr>
-          <w:p>
-            <w:pPr>
-              <w:spacing w:after="0"/>
-            </w:pPr>
-            <w:r>
-              <w:rPr>
-                <w:b w:val="0"/>
-                <w:i w:val="0"/>
-                <w:color w:val="1A2325"/>
-                <w:sz w:val="17"/>
-              </w:rPr>
-              <w:t>Dra. E. Teresa Cuatecontzi Xochitiotzi</w:t>
-            </w:r>
-          </w:p>
-        </w:tc>
-        <w:tc>
-          <w:tcPr>
-            <w:tcW w:type="dxa" w:w="907"/>
-          </w:tcPr>
-          <w:p>
-            <w:pPr>
-              <w:spacing w:after="0"/>
-            </w:pPr>
-            <w:r>
-              <w:rPr>
-                <w:b w:val="0"/>
-                <w:i w:val="0"/>
-                <w:color w:val="1A2325"/>
-                <w:sz w:val="17"/>
-              </w:rPr>
-              <w:t>30 min</w:t>
-            </w:r>
-          </w:p>
-        </w:tc>
-      </w:tr>
-      <w:tr>
-        <w:tc>
-          <w:tcPr>
-            <w:tcW w:type="dxa" w:w="907"/>
-          </w:tcPr>
-          <w:p>
-            <w:pPr>
-              <w:spacing w:after="0"/>
-            </w:pPr>
-            <w:r>
-              <w:rPr>
-                <w:b w:val="0"/>
-                <w:i w:val="0"/>
-                <w:color w:val="1A2325"/>
-                <w:sz w:val="17"/>
-              </w:rPr>
-              <w:t>M3 · C4</w:t>
-            </w:r>
-          </w:p>
-        </w:tc>
-        <w:tc>
-          <w:tcPr>
-            <w:tcW w:type="dxa" w:w="4876"/>
-          </w:tcPr>
-          <w:p>
-            <w:pPr>
-              <w:spacing w:after="0"/>
-            </w:pPr>
-            <w:r>
-              <w:rPr>
-                <w:b/>
-                <w:i w:val="0"/>
-                <w:color w:val="1A2325"/>
-                <w:sz w:val="17"/>
-              </w:rPr>
-              <w:t>Cirugía bariátrica</w:t>
-            </w:r>
-            <w:r>
-              <w:rPr>
-                <w:b w:val="0"/>
-                <w:i w:val="0"/>
-                <w:color w:val="1A2325"/>
-                <w:sz w:val="17"/>
-              </w:rPr>
-              <w:br/>
-              <w:t>Indicaciones; técnicas quirúrgicas; seguimiento metabólico</w:t>
-            </w:r>
-          </w:p>
-        </w:tc>
-        <w:tc>
-          <w:tcPr>
-            <w:tcW w:type="dxa" w:w="2494"/>
-          </w:tcPr>
-          <w:p>
-            <w:pPr>
-              <w:spacing w:after="0"/>
-            </w:pPr>
-            <w:r>
-              <w:rPr>
-                <w:b w:val="0"/>
-                <w:i w:val="0"/>
-                <w:color w:val="1A2325"/>
-                <w:sz w:val="17"/>
-              </w:rPr>
-              <w:t>Dr. Cristian Oswaldo Castillo Cabrera</w:t>
-            </w:r>
-          </w:p>
-        </w:tc>
-        <w:tc>
-          <w:tcPr>
-            <w:tcW w:type="dxa" w:w="907"/>
-          </w:tcPr>
-          <w:p>
-            <w:pPr>
-              <w:spacing w:after="0"/>
-            </w:pPr>
-            <w:r>
-              <w:rPr>
-                <w:b w:val="0"/>
-                <w:i w:val="0"/>
-                <w:color w:val="1A2325"/>
-                <w:sz w:val="17"/>
-              </w:rPr>
-              <w:t>30 min</w:t>
-            </w:r>
-          </w:p>
-        </w:tc>
-      </w:tr>
-    </w:tbl>
-    <w:p>
-      <w:pPr>
-        <w:spacing w:after="40"/>
-      </w:pPr>
-    </w:p>
-    <w:p>
-      <w:pPr>
-        <w:keepNext/>
-        <w:spacing w:before="120" w:after="40"/>
-      </w:pPr>
-      <w:r>
-        <w:rPr>
-          <w:b/>
-          <w:i w:val="0"/>
-          <w:color w:val="0D5A62"/>
-        </w:rPr>
-        <w:t>Módulo 4 · Diabetes mellitus: diagnóstico y manejo actual</w:t>
-      </w:r>
-    </w:p>
-    <w:p>
-      <w:pPr>
-        <w:keepNext/>
-        <w:spacing w:before="0" w:after="60"/>
-      </w:pPr>
-      <w:r>
-        <w:rPr>
-          <w:b w:val="0"/>
-          <w:i/>
-          <w:color w:val="5F7073"/>
-          <w:sz w:val="18"/>
-        </w:rPr>
-        <w:t>Publicación: jueves 19 de noviembre de 2026</w:t>
-      </w:r>
-    </w:p>
-    <w:tbl>
-      <w:tblPr>
-        <w:tblStyle w:val="TableGrid"/>
-        <w:tblW w:type="auto" w:w="0"/>
-        <w:jc w:val="center"/>
-        <w:tblLayout w:type="fixed"/>
-        <w:tblLook w:firstColumn="1" w:firstRow="1" w:lastColumn="0" w:lastRow="0" w:noHBand="0" w:noVBand="1" w:val="04A0"/>
-      </w:tblPr>
-      <w:tblGrid>
-        <w:gridCol w:w="907"/>
-        <w:gridCol w:w="4876"/>
-        <w:gridCol w:w="2494"/>
-        <w:gridCol w:w="907"/>
-      </w:tblGrid>
-      <w:tr>
-        <w:tc>
-          <w:tcPr>
-            <w:tcW w:type="dxa" w:w="907"/>
-            <w:shd w:val="clear" w:color="auto" w:fill="0D5A62"/>
-          </w:tcPr>
-          <w:p>
-            <w:pPr>
-              <w:spacing w:after="0"/>
-            </w:pPr>
-            <w:r>
-              <w:rPr>
-                <w:b/>
-                <w:i w:val="0"/>
-                <w:color w:val="FFFFFF"/>
-                <w:sz w:val="17"/>
-              </w:rPr>
-              <w:t>Clase</w:t>
-            </w:r>
-          </w:p>
-        </w:tc>
-        <w:tc>
-          <w:tcPr>
-            <w:tcW w:type="dxa" w:w="4876"/>
-            <w:shd w:val="clear" w:color="auto" w:fill="0D5A62"/>
-          </w:tcPr>
-          <w:p>
-            <w:pPr>
-              <w:spacing w:after="0"/>
-            </w:pPr>
-            <w:r>
-              <w:rPr>
-                <w:b/>
-                <w:i w:val="0"/>
-                <w:color w:val="FFFFFF"/>
-                <w:sz w:val="17"/>
-              </w:rPr>
-              <w:t>Tema y contenidos</w:t>
-            </w:r>
-          </w:p>
-        </w:tc>
-        <w:tc>
-          <w:tcPr>
-            <w:tcW w:type="dxa" w:w="2494"/>
-            <w:shd w:val="clear" w:color="auto" w:fill="0D5A62"/>
-          </w:tcPr>
-          <w:p>
-            <w:pPr>
-              <w:spacing w:after="0"/>
-            </w:pPr>
-            <w:r>
-              <w:rPr>
-                <w:b/>
-                <w:i w:val="0"/>
-                <w:color w:val="FFFFFF"/>
-                <w:sz w:val="17"/>
-              </w:rPr>
-              <w:t>Expositor</w:t>
-            </w:r>
-          </w:p>
-        </w:tc>
-        <w:tc>
-          <w:tcPr>
-            <w:tcW w:type="dxa" w:w="907"/>
-            <w:shd w:val="clear" w:color="auto" w:fill="0D5A62"/>
-          </w:tcPr>
-          <w:p>
-            <w:pPr>
-              <w:spacing w:after="0"/>
-            </w:pPr>
-            <w:r>
-              <w:rPr>
-                <w:b/>
-                <w:i w:val="0"/>
-                <w:color w:val="FFFFFF"/>
-                <w:sz w:val="17"/>
-              </w:rPr>
-              <w:t>Duración</w:t>
-            </w:r>
-          </w:p>
-        </w:tc>
-      </w:tr>
-      <w:tr>
-        <w:tc>
-          <w:tcPr>
-            <w:tcW w:type="dxa" w:w="907"/>
-          </w:tcPr>
-          <w:p>
-            <w:pPr>
-              <w:spacing w:after="0"/>
-            </w:pPr>
-            <w:r>
-              <w:rPr>
-                <w:b w:val="0"/>
-                <w:i w:val="0"/>
-                <w:color w:val="1A2325"/>
-                <w:sz w:val="17"/>
-              </w:rPr>
-              <w:t>M4 · C1</w:t>
-            </w:r>
-          </w:p>
-        </w:tc>
-        <w:tc>
-          <w:tcPr>
-            <w:tcW w:type="dxa" w:w="4876"/>
-          </w:tcPr>
-          <w:p>
-            <w:pPr>
-              <w:spacing w:after="0"/>
-            </w:pPr>
-            <w:r>
-              <w:rPr>
-                <w:b/>
-                <w:i w:val="0"/>
-                <w:color w:val="1A2325"/>
-                <w:sz w:val="17"/>
-              </w:rPr>
-              <w:t>Fisiopatología y clasificación de la diabetes</w:t>
-            </w:r>
-            <w:r>
-              <w:rPr>
-                <w:b w:val="0"/>
-                <w:i w:val="0"/>
-                <w:color w:val="1A2325"/>
-                <w:sz w:val="17"/>
-              </w:rPr>
-              <w:br/>
-              <w:t>Defectos fisiopatológicos de la DM2; clasificación actual; diagnóstico temprano</w:t>
-            </w:r>
-          </w:p>
-        </w:tc>
-        <w:tc>
-          <w:tcPr>
-            <w:tcW w:type="dxa" w:w="2494"/>
-          </w:tcPr>
-          <w:p>
-            <w:pPr>
-              <w:spacing w:after="0"/>
-            </w:pPr>
-            <w:r>
-              <w:rPr>
-                <w:b w:val="0"/>
-                <w:i w:val="0"/>
-                <w:color w:val="1A2325"/>
-                <w:sz w:val="17"/>
-              </w:rPr>
-              <w:t>Dra. María Paz Castillo Cabrera</w:t>
-            </w:r>
-          </w:p>
-        </w:tc>
-        <w:tc>
-          <w:tcPr>
-            <w:tcW w:type="dxa" w:w="907"/>
-          </w:tcPr>
-          <w:p>
-            <w:pPr>
-              <w:spacing w:after="0"/>
-            </w:pPr>
-            <w:r>
-              <w:rPr>
-                <w:b w:val="0"/>
-                <w:i w:val="0"/>
-                <w:color w:val="1A2325"/>
-                <w:sz w:val="17"/>
-              </w:rPr>
-              <w:t>30 min</w:t>
-            </w:r>
-          </w:p>
-        </w:tc>
-      </w:tr>
-      <w:tr>
-        <w:tc>
-          <w:tcPr>
-            <w:tcW w:type="dxa" w:w="907"/>
-          </w:tcPr>
-          <w:p>
-            <w:pPr>
-              <w:spacing w:after="0"/>
-            </w:pPr>
-            <w:r>
-              <w:rPr>
-                <w:b w:val="0"/>
-                <w:i w:val="0"/>
-                <w:color w:val="1A2325"/>
-                <w:sz w:val="17"/>
-              </w:rPr>
-              <w:t>M4 · C2</w:t>
-            </w:r>
-          </w:p>
-        </w:tc>
-        <w:tc>
-          <w:tcPr>
-            <w:tcW w:type="dxa" w:w="4876"/>
-          </w:tcPr>
-          <w:p>
-            <w:pPr>
-              <w:spacing w:after="0"/>
-            </w:pPr>
-            <w:r>
-              <w:rPr>
-                <w:b/>
-                <w:i w:val="0"/>
-                <w:color w:val="1A2325"/>
-                <w:sz w:val="17"/>
-              </w:rPr>
-              <w:t>Monitoreo glucémico y metas terapéuticas</w:t>
-            </w:r>
-            <w:r>
-              <w:rPr>
-                <w:b w:val="0"/>
-                <w:i w:val="0"/>
-                <w:color w:val="1A2325"/>
-                <w:sz w:val="17"/>
-              </w:rPr>
-              <w:br/>
-              <w:t>HbA1c; tiempo en rango; AGP y monitoreo continuo de glucosa</w:t>
-            </w:r>
-          </w:p>
-        </w:tc>
-        <w:tc>
-          <w:tcPr>
-            <w:tcW w:type="dxa" w:w="2494"/>
-          </w:tcPr>
-          <w:p>
-            <w:pPr>
-              <w:spacing w:after="0"/>
-            </w:pPr>
-            <w:r>
-              <w:rPr>
-                <w:b w:val="0"/>
-                <w:i w:val="0"/>
-                <w:color w:val="1A2325"/>
-                <w:sz w:val="17"/>
-              </w:rPr>
-              <w:t>Dra. Josefa Elizabeth Palacio Riofrío</w:t>
-            </w:r>
-          </w:p>
-        </w:tc>
-        <w:tc>
-          <w:tcPr>
-            <w:tcW w:type="dxa" w:w="907"/>
-          </w:tcPr>
-          <w:p>
-            <w:pPr>
-              <w:spacing w:after="0"/>
-            </w:pPr>
-            <w:r>
-              <w:rPr>
-                <w:b w:val="0"/>
-                <w:i w:val="0"/>
-                <w:color w:val="1A2325"/>
-                <w:sz w:val="17"/>
-              </w:rPr>
-              <w:t>30 min</w:t>
-            </w:r>
-          </w:p>
-        </w:tc>
-      </w:tr>
-      <w:tr>
-        <w:tc>
-          <w:tcPr>
-            <w:tcW w:type="dxa" w:w="907"/>
-          </w:tcPr>
-          <w:p>
-            <w:pPr>
-              <w:spacing w:after="0"/>
-            </w:pPr>
-            <w:r>
-              <w:rPr>
-                <w:b w:val="0"/>
-                <w:i w:val="0"/>
-                <w:color w:val="1A2325"/>
-                <w:sz w:val="17"/>
-              </w:rPr>
-              <w:t>M4 · C3</w:t>
-            </w:r>
-          </w:p>
-        </w:tc>
-        <w:tc>
-          <w:tcPr>
-            <w:tcW w:type="dxa" w:w="4876"/>
-          </w:tcPr>
-          <w:p>
-            <w:pPr>
-              <w:spacing w:after="0"/>
-            </w:pPr>
-            <w:r>
-              <w:rPr>
-                <w:b/>
-                <w:i w:val="0"/>
-                <w:color w:val="1A2325"/>
-                <w:sz w:val="17"/>
-              </w:rPr>
-              <w:t>Terapia farmacológica moderna</w:t>
-            </w:r>
-            <w:r>
-              <w:rPr>
-                <w:b w:val="0"/>
-                <w:i w:val="0"/>
-                <w:color w:val="1A2325"/>
-                <w:sz w:val="17"/>
-              </w:rPr>
-              <w:br/>
-              <w:t>iSGLT2 e iDPP-4; agonistas de GLP-1 y tirzepatida; individualización</w:t>
-            </w:r>
-          </w:p>
-        </w:tc>
-        <w:tc>
-          <w:tcPr>
-            <w:tcW w:type="dxa" w:w="2494"/>
-          </w:tcPr>
-          <w:p>
-            <w:pPr>
-              <w:spacing w:after="0"/>
-            </w:pPr>
-            <w:r>
-              <w:rPr>
-                <w:b w:val="0"/>
-                <w:i w:val="0"/>
-                <w:color w:val="1A2325"/>
-                <w:sz w:val="17"/>
-              </w:rPr>
-              <w:t>Dra. Marcia Gabriela Jiménez Encalada</w:t>
-            </w:r>
-          </w:p>
-        </w:tc>
-        <w:tc>
-          <w:tcPr>
-            <w:tcW w:type="dxa" w:w="907"/>
-          </w:tcPr>
-          <w:p>
-            <w:pPr>
-              <w:spacing w:after="0"/>
-            </w:pPr>
-            <w:r>
-              <w:rPr>
-                <w:b w:val="0"/>
-                <w:i w:val="0"/>
-                <w:color w:val="1A2325"/>
-                <w:sz w:val="17"/>
-              </w:rPr>
-              <w:t>30 min</w:t>
-            </w:r>
-          </w:p>
-        </w:tc>
-      </w:tr>
-      <w:tr>
-        <w:tc>
-          <w:tcPr>
-            <w:tcW w:type="dxa" w:w="907"/>
-          </w:tcPr>
-          <w:p>
-            <w:pPr>
-              <w:spacing w:after="0"/>
-            </w:pPr>
-            <w:r>
-              <w:rPr>
-                <w:b w:val="0"/>
-                <w:i w:val="0"/>
-                <w:color w:val="1A2325"/>
-                <w:sz w:val="17"/>
-              </w:rPr>
-              <w:t>M4 · C4</w:t>
-            </w:r>
-          </w:p>
-        </w:tc>
-        <w:tc>
-          <w:tcPr>
-            <w:tcW w:type="dxa" w:w="4876"/>
-          </w:tcPr>
-          <w:p>
-            <w:pPr>
-              <w:spacing w:after="0"/>
-            </w:pPr>
-            <w:r>
-              <w:rPr>
-                <w:b/>
-                <w:i w:val="0"/>
-                <w:color w:val="1A2325"/>
-                <w:sz w:val="17"/>
-              </w:rPr>
-              <w:t>Insulinoterapia avanzada</w:t>
-            </w:r>
-            <w:r>
-              <w:rPr>
-                <w:b w:val="0"/>
-                <w:i w:val="0"/>
-                <w:color w:val="1A2325"/>
-                <w:sz w:val="17"/>
-              </w:rPr>
-              <w:br/>
-              <w:t>Inicio e intensificación; combinación con agonistas de GLP-1; manejo de hipoglucemia</w:t>
-            </w:r>
-          </w:p>
-        </w:tc>
-        <w:tc>
-          <w:tcPr>
-            <w:tcW w:type="dxa" w:w="2494"/>
-          </w:tcPr>
-          <w:p>
-            <w:pPr>
-              <w:spacing w:after="0"/>
-            </w:pPr>
-            <w:r>
-              <w:rPr>
-                <w:b w:val="0"/>
-                <w:i w:val="0"/>
-                <w:color w:val="1A2325"/>
-                <w:sz w:val="17"/>
-              </w:rPr>
-              <w:t>Dr. Juan Fernando Molina Galarza</w:t>
-            </w:r>
-          </w:p>
-        </w:tc>
-        <w:tc>
-          <w:tcPr>
-            <w:tcW w:type="dxa" w:w="907"/>
-          </w:tcPr>
-          <w:p>
-            <w:pPr>
-              <w:spacing w:after="0"/>
-            </w:pPr>
-            <w:r>
-              <w:rPr>
-                <w:b w:val="0"/>
-                <w:i w:val="0"/>
-                <w:color w:val="1A2325"/>
-                <w:sz w:val="17"/>
-              </w:rPr>
-              <w:t>30 min</w:t>
-            </w:r>
-          </w:p>
-        </w:tc>
-      </w:tr>
-    </w:tbl>
-    <w:p>
-      <w:pPr>
-        <w:spacing w:after="40"/>
-      </w:pPr>
-    </w:p>
-    <w:p>
-      <w:pPr>
-        <w:keepNext/>
-        <w:spacing w:before="120" w:after="40"/>
-      </w:pPr>
-      <w:r>
-        <w:rPr>
-          <w:b/>
-          <w:i w:val="0"/>
-          <w:color w:val="0D5A62"/>
-        </w:rPr>
-        <w:t>Módulo 5 · Terapia nutricional en diabetes y obesidad</w:t>
       </w:r>
     </w:p>
     <w:p>
@@ -3131,7 +1682,7 @@
                 <w:color w:val="1A2325"/>
                 <w:sz w:val="17"/>
               </w:rPr>
-              <w:t>M5 · C1</w:t>
+              <w:t>M2 · C1</w:t>
             </w:r>
           </w:p>
         </w:tc>
@@ -3150,7 +1701,7 @@
                 <w:color w:val="1A2325"/>
                 <w:sz w:val="17"/>
               </w:rPr>
-              <w:t>Nutrición de precisión en diabetes y obesidad: innovación, equidad y desafíos para América Latina y Ecuador</w:t>
+              <w:t>Principios de terapia nutricional</w:t>
             </w:r>
             <w:r>
               <w:rPr>
@@ -3160,7 +1711,7 @@
                 <w:sz w:val="17"/>
               </w:rPr>
               <w:br/>
-              <w:t>Fenotipos metabólicos; individualización nutricional</w:t>
+              <w:t>Balance energético; calidad nutricional; individualización del tratamiento</w:t>
             </w:r>
           </w:p>
         </w:tc>
@@ -3179,7 +1730,7 @@
                 <w:color w:val="1A2325"/>
                 <w:sz w:val="17"/>
               </w:rPr>
-              <w:t>Lcda. Gabriela Estefanía Molina Ochoa, Mgt.</w:t>
+              <w:t>Lcda. María Isabel Reinoso Pesántez</w:t>
             </w:r>
           </w:p>
         </w:tc>
@@ -3219,7 +1770,7 @@
                 <w:color w:val="1A2325"/>
                 <w:sz w:val="17"/>
               </w:rPr>
-              <w:t>M5 · C2</w:t>
+              <w:t>M2 · C2</w:t>
             </w:r>
           </w:p>
         </w:tc>
@@ -3238,7 +1789,7 @@
                 <w:color w:val="1A2325"/>
                 <w:sz w:val="17"/>
               </w:rPr>
-              <w:t>Estrategias nutricionales basadas en evidencia</w:t>
+              <w:t>Patrones alimentarios basados en evidencia</w:t>
             </w:r>
             <w:r>
               <w:rPr>
@@ -3248,7 +1799,7 @@
                 <w:sz w:val="17"/>
               </w:rPr>
               <w:br/>
-              <w:t>Dieta mediterránea; restricción de carbohidratos; ayuno intermitente</w:t>
+              <w:t>Dieta mediterránea; dieta DASH; dietas bajas en carbohidratos; ayuno intermitente</w:t>
             </w:r>
           </w:p>
         </w:tc>
@@ -3267,7 +1818,7 @@
                 <w:color w:val="1A2325"/>
                 <w:sz w:val="17"/>
               </w:rPr>
-              <w:t>Dr. Ramón de Cangas Morán</w:t>
+              <w:t>Dra. Johanna Piedra Bravo</w:t>
             </w:r>
           </w:p>
         </w:tc>
@@ -3307,7 +1858,7 @@
                 <w:color w:val="1A2325"/>
                 <w:sz w:val="17"/>
               </w:rPr>
-              <w:t>M5 · C3</w:t>
+              <w:t>M2 · C3</w:t>
             </w:r>
           </w:p>
         </w:tc>
@@ -3326,7 +1877,7 @@
                 <w:color w:val="1A2325"/>
                 <w:sz w:val="17"/>
               </w:rPr>
-              <w:t>Nutrición durante las terapias para obesidad</w:t>
+              <w:t>Nutrición conductual</w:t>
             </w:r>
             <w:r>
               <w:rPr>
@@ -3336,7 +1887,7 @@
                 <w:sz w:val="17"/>
               </w:rPr>
               <w:br/>
-              <w:t>Agonistas de GLP-1; tirzepatida; preservación de la masa muscular</w:t>
+              <w:t>Hambre fisiológica y emocional; conducta alimentaria; adherencia terapéutica</w:t>
             </w:r>
           </w:p>
         </w:tc>
@@ -3355,7 +1906,7 @@
                 <w:color w:val="1A2325"/>
                 <w:sz w:val="17"/>
               </w:rPr>
-              <w:t>Dra. María Gabriela Machado Orellana</w:t>
+              <w:t>Dra. Marcia Janneth Bermeo Cabrera</w:t>
             </w:r>
           </w:p>
         </w:tc>
@@ -3395,7 +1946,7 @@
                 <w:color w:val="1A2325"/>
                 <w:sz w:val="17"/>
               </w:rPr>
-              <w:t>M5 · C4</w:t>
+              <w:t>M2 · C4</w:t>
             </w:r>
           </w:p>
         </w:tc>
@@ -3414,7 +1965,7 @@
                 <w:color w:val="1A2325"/>
                 <w:sz w:val="17"/>
               </w:rPr>
-              <w:t>Composición corporal y sarcopenia en pacientes con diabetes</w:t>
+              <w:t>Actividad física en obesidad</w:t>
             </w:r>
             <w:r>
               <w:rPr>
@@ -3424,7 +1975,7 @@
                 <w:sz w:val="17"/>
               </w:rPr>
               <w:br/>
-              <w:t>Evaluación clínica; interpretación de la bioimpedancia; estrategias nutricionales</w:t>
+              <w:t>Ejercicio aeróbico; entrenamiento de fuerza; prescripción de ejercicio</w:t>
             </w:r>
           </w:p>
         </w:tc>
@@ -3443,7 +1994,7 @@
                 <w:color w:val="1A2325"/>
                 <w:sz w:val="17"/>
               </w:rPr>
-              <w:t>Dra. Lizbet Yolanda Ruilova González</w:t>
+              <w:t>Dra. Julia Castro de González</w:t>
             </w:r>
           </w:p>
         </w:tc>
@@ -3484,7 +2035,7 @@
           <w:i w:val="0"/>
           <w:color w:val="0D5A62"/>
         </w:rPr>
-        <w:t>Módulo 6 · Complicaciones cardiorrenometabólicas</w:t>
+        <w:t>Módulo 3 · Tratamiento farmacológico y cirugía de la obesidad</w:t>
       </w:r>
     </w:p>
     <w:p>
@@ -3614,6 +2165,1455 @@
                 <w:color w:val="1A2325"/>
                 <w:sz w:val="17"/>
               </w:rPr>
+              <w:t>M3 · C1</w:t>
+            </w:r>
+          </w:p>
+        </w:tc>
+        <w:tc>
+          <w:tcPr>
+            <w:tcW w:type="dxa" w:w="4876"/>
+          </w:tcPr>
+          <w:p>
+            <w:pPr>
+              <w:spacing w:after="0"/>
+            </w:pPr>
+            <w:r>
+              <w:rPr>
+                <w:b/>
+                <w:i w:val="0"/>
+                <w:color w:val="1A2325"/>
+                <w:sz w:val="17"/>
+              </w:rPr>
+              <w:t>Farmacoterapia para obesidad</w:t>
+            </w:r>
+            <w:r>
+              <w:rPr>
+                <w:b w:val="0"/>
+                <w:i w:val="0"/>
+                <w:color w:val="1A2325"/>
+                <w:sz w:val="17"/>
+              </w:rPr>
+              <w:br/>
+              <w:t>Indicaciones generales; orlistat; fentermina; fentermina/topiramato; bupropión/naltrexona</w:t>
+            </w:r>
+          </w:p>
+        </w:tc>
+        <w:tc>
+          <w:tcPr>
+            <w:tcW w:type="dxa" w:w="2494"/>
+          </w:tcPr>
+          <w:p>
+            <w:pPr>
+              <w:spacing w:after="0"/>
+            </w:pPr>
+            <w:r>
+              <w:rPr>
+                <w:b w:val="0"/>
+                <w:i w:val="0"/>
+                <w:color w:val="1A2325"/>
+                <w:sz w:val="17"/>
+              </w:rPr>
+              <w:t>Dr. Pablo Esteban Vanegas Cedillo</w:t>
+            </w:r>
+          </w:p>
+        </w:tc>
+        <w:tc>
+          <w:tcPr>
+            <w:tcW w:type="dxa" w:w="907"/>
+          </w:tcPr>
+          <w:p>
+            <w:pPr>
+              <w:spacing w:after="0"/>
+            </w:pPr>
+            <w:r>
+              <w:rPr>
+                <w:b w:val="0"/>
+                <w:i w:val="0"/>
+                <w:color w:val="1A2325"/>
+                <w:sz w:val="17"/>
+              </w:rPr>
+              <w:t>30 min</w:t>
+            </w:r>
+          </w:p>
+        </w:tc>
+      </w:tr>
+      <w:tr>
+        <w:tc>
+          <w:tcPr>
+            <w:tcW w:type="dxa" w:w="907"/>
+          </w:tcPr>
+          <w:p>
+            <w:pPr>
+              <w:spacing w:after="0"/>
+            </w:pPr>
+            <w:r>
+              <w:rPr>
+                <w:b w:val="0"/>
+                <w:i w:val="0"/>
+                <w:color w:val="1A2325"/>
+                <w:sz w:val="17"/>
+              </w:rPr>
+              <w:t>M3 · C2</w:t>
+            </w:r>
+          </w:p>
+        </w:tc>
+        <w:tc>
+          <w:tcPr>
+            <w:tcW w:type="dxa" w:w="4876"/>
+          </w:tcPr>
+          <w:p>
+            <w:pPr>
+              <w:spacing w:after="0"/>
+            </w:pPr>
+            <w:r>
+              <w:rPr>
+                <w:b/>
+                <w:i w:val="0"/>
+                <w:color w:val="1A2325"/>
+                <w:sz w:val="17"/>
+              </w:rPr>
+              <w:t>Agonistas del receptor de GLP-1</w:t>
+            </w:r>
+            <w:r>
+              <w:rPr>
+                <w:b w:val="0"/>
+                <w:i w:val="0"/>
+                <w:color w:val="1A2325"/>
+                <w:sz w:val="17"/>
+              </w:rPr>
+              <w:br/>
+              <w:t>Semaglutida; evidencia clínica</w:t>
+            </w:r>
+          </w:p>
+        </w:tc>
+        <w:tc>
+          <w:tcPr>
+            <w:tcW w:type="dxa" w:w="2494"/>
+          </w:tcPr>
+          <w:p>
+            <w:pPr>
+              <w:spacing w:after="0"/>
+            </w:pPr>
+            <w:r>
+              <w:rPr>
+                <w:b w:val="0"/>
+                <w:i w:val="0"/>
+                <w:color w:val="1A2325"/>
+                <w:sz w:val="17"/>
+              </w:rPr>
+              <w:t>Dra. Omidres de la Consolación Pérez de Carvelli</w:t>
+            </w:r>
+          </w:p>
+        </w:tc>
+        <w:tc>
+          <w:tcPr>
+            <w:tcW w:type="dxa" w:w="907"/>
+          </w:tcPr>
+          <w:p>
+            <w:pPr>
+              <w:spacing w:after="0"/>
+            </w:pPr>
+            <w:r>
+              <w:rPr>
+                <w:b w:val="0"/>
+                <w:i w:val="0"/>
+                <w:color w:val="1A2325"/>
+                <w:sz w:val="17"/>
+              </w:rPr>
+              <w:t>30 min</w:t>
+            </w:r>
+          </w:p>
+        </w:tc>
+      </w:tr>
+      <w:tr>
+        <w:tc>
+          <w:tcPr>
+            <w:tcW w:type="dxa" w:w="907"/>
+          </w:tcPr>
+          <w:p>
+            <w:pPr>
+              <w:spacing w:after="0"/>
+            </w:pPr>
+            <w:r>
+              <w:rPr>
+                <w:b w:val="0"/>
+                <w:i w:val="0"/>
+                <w:color w:val="1A2325"/>
+                <w:sz w:val="17"/>
+              </w:rPr>
+              <w:t>M3 · C3</w:t>
+            </w:r>
+          </w:p>
+        </w:tc>
+        <w:tc>
+          <w:tcPr>
+            <w:tcW w:type="dxa" w:w="4876"/>
+          </w:tcPr>
+          <w:p>
+            <w:pPr>
+              <w:spacing w:after="0"/>
+            </w:pPr>
+            <w:r>
+              <w:rPr>
+                <w:b/>
+                <w:i w:val="0"/>
+                <w:color w:val="1A2325"/>
+                <w:sz w:val="17"/>
+              </w:rPr>
+              <w:t>Tirzepatida y nuevas terapias</w:t>
+            </w:r>
+            <w:r>
+              <w:rPr>
+                <w:b w:val="0"/>
+                <w:i w:val="0"/>
+                <w:color w:val="1A2325"/>
+                <w:sz w:val="17"/>
+              </w:rPr>
+              <w:br/>
+              <w:t>Mecanismos de acción; evidencia clínica; seguridad</w:t>
+            </w:r>
+          </w:p>
+        </w:tc>
+        <w:tc>
+          <w:tcPr>
+            <w:tcW w:type="dxa" w:w="2494"/>
+          </w:tcPr>
+          <w:p>
+            <w:pPr>
+              <w:spacing w:after="0"/>
+            </w:pPr>
+            <w:r>
+              <w:rPr>
+                <w:b w:val="0"/>
+                <w:i w:val="0"/>
+                <w:color w:val="1A2325"/>
+                <w:sz w:val="17"/>
+              </w:rPr>
+              <w:t>Dra. E. Teresa Cuatecontzi Xochitiotzi</w:t>
+            </w:r>
+          </w:p>
+        </w:tc>
+        <w:tc>
+          <w:tcPr>
+            <w:tcW w:type="dxa" w:w="907"/>
+          </w:tcPr>
+          <w:p>
+            <w:pPr>
+              <w:spacing w:after="0"/>
+            </w:pPr>
+            <w:r>
+              <w:rPr>
+                <w:b w:val="0"/>
+                <w:i w:val="0"/>
+                <w:color w:val="1A2325"/>
+                <w:sz w:val="17"/>
+              </w:rPr>
+              <w:t>30 min</w:t>
+            </w:r>
+          </w:p>
+        </w:tc>
+      </w:tr>
+      <w:tr>
+        <w:tc>
+          <w:tcPr>
+            <w:tcW w:type="dxa" w:w="907"/>
+          </w:tcPr>
+          <w:p>
+            <w:pPr>
+              <w:spacing w:after="0"/>
+            </w:pPr>
+            <w:r>
+              <w:rPr>
+                <w:b w:val="0"/>
+                <w:i w:val="0"/>
+                <w:color w:val="1A2325"/>
+                <w:sz w:val="17"/>
+              </w:rPr>
+              <w:t>M3 · C4</w:t>
+            </w:r>
+          </w:p>
+        </w:tc>
+        <w:tc>
+          <w:tcPr>
+            <w:tcW w:type="dxa" w:w="4876"/>
+          </w:tcPr>
+          <w:p>
+            <w:pPr>
+              <w:spacing w:after="0"/>
+            </w:pPr>
+            <w:r>
+              <w:rPr>
+                <w:b/>
+                <w:i w:val="0"/>
+                <w:color w:val="1A2325"/>
+                <w:sz w:val="17"/>
+              </w:rPr>
+              <w:t>Cirugía bariátrica</w:t>
+            </w:r>
+            <w:r>
+              <w:rPr>
+                <w:b w:val="0"/>
+                <w:i w:val="0"/>
+                <w:color w:val="1A2325"/>
+                <w:sz w:val="17"/>
+              </w:rPr>
+              <w:br/>
+              <w:t>Indicaciones; técnicas quirúrgicas; seguimiento metabólico</w:t>
+            </w:r>
+          </w:p>
+        </w:tc>
+        <w:tc>
+          <w:tcPr>
+            <w:tcW w:type="dxa" w:w="2494"/>
+          </w:tcPr>
+          <w:p>
+            <w:pPr>
+              <w:spacing w:after="0"/>
+            </w:pPr>
+            <w:r>
+              <w:rPr>
+                <w:b w:val="0"/>
+                <w:i w:val="0"/>
+                <w:color w:val="1A2325"/>
+                <w:sz w:val="17"/>
+              </w:rPr>
+              <w:t>Dr. Cristian Oswaldo Castillo Cabrera</w:t>
+            </w:r>
+          </w:p>
+        </w:tc>
+        <w:tc>
+          <w:tcPr>
+            <w:tcW w:type="dxa" w:w="907"/>
+          </w:tcPr>
+          <w:p>
+            <w:pPr>
+              <w:spacing w:after="0"/>
+            </w:pPr>
+            <w:r>
+              <w:rPr>
+                <w:b w:val="0"/>
+                <w:i w:val="0"/>
+                <w:color w:val="1A2325"/>
+                <w:sz w:val="17"/>
+              </w:rPr>
+              <w:t>30 min</w:t>
+            </w:r>
+          </w:p>
+        </w:tc>
+      </w:tr>
+    </w:tbl>
+    <w:p>
+      <w:pPr>
+        <w:spacing w:after="40"/>
+      </w:pPr>
+    </w:p>
+    <w:p>
+      <w:pPr>
+        <w:keepNext/>
+        <w:spacing w:before="120" w:after="40"/>
+      </w:pPr>
+      <w:r>
+        <w:rPr>
+          <w:b/>
+          <w:i w:val="0"/>
+          <w:color w:val="0D5A62"/>
+        </w:rPr>
+        <w:t>Módulo 4 · Diabetes mellitus: diagnóstico y manejo actual</w:t>
+      </w:r>
+    </w:p>
+    <w:p>
+      <w:pPr>
+        <w:keepNext/>
+        <w:spacing w:before="0" w:after="60"/>
+      </w:pPr>
+      <w:r>
+        <w:rPr>
+          <w:b w:val="0"/>
+          <w:i/>
+          <w:color w:val="5F7073"/>
+          <w:sz w:val="18"/>
+        </w:rPr>
+        <w:t>Publicación: jueves 10 de diciembre de 2026</w:t>
+      </w:r>
+    </w:p>
+    <w:tbl>
+      <w:tblPr>
+        <w:tblStyle w:val="TableGrid"/>
+        <w:tblW w:type="auto" w:w="0"/>
+        <w:jc w:val="center"/>
+        <w:tblLayout w:type="fixed"/>
+        <w:tblLook w:firstColumn="1" w:firstRow="1" w:lastColumn="0" w:lastRow="0" w:noHBand="0" w:noVBand="1" w:val="04A0"/>
+      </w:tblPr>
+      <w:tblGrid>
+        <w:gridCol w:w="907"/>
+        <w:gridCol w:w="4876"/>
+        <w:gridCol w:w="2494"/>
+        <w:gridCol w:w="907"/>
+      </w:tblGrid>
+      <w:tr>
+        <w:tc>
+          <w:tcPr>
+            <w:tcW w:type="dxa" w:w="907"/>
+            <w:shd w:val="clear" w:color="auto" w:fill="0D5A62"/>
+          </w:tcPr>
+          <w:p>
+            <w:pPr>
+              <w:spacing w:after="0"/>
+            </w:pPr>
+            <w:r>
+              <w:rPr>
+                <w:b/>
+                <w:i w:val="0"/>
+                <w:color w:val="FFFFFF"/>
+                <w:sz w:val="17"/>
+              </w:rPr>
+              <w:t>Clase</w:t>
+            </w:r>
+          </w:p>
+        </w:tc>
+        <w:tc>
+          <w:tcPr>
+            <w:tcW w:type="dxa" w:w="4876"/>
+            <w:shd w:val="clear" w:color="auto" w:fill="0D5A62"/>
+          </w:tcPr>
+          <w:p>
+            <w:pPr>
+              <w:spacing w:after="0"/>
+            </w:pPr>
+            <w:r>
+              <w:rPr>
+                <w:b/>
+                <w:i w:val="0"/>
+                <w:color w:val="FFFFFF"/>
+                <w:sz w:val="17"/>
+              </w:rPr>
+              <w:t>Tema y contenidos</w:t>
+            </w:r>
+          </w:p>
+        </w:tc>
+        <w:tc>
+          <w:tcPr>
+            <w:tcW w:type="dxa" w:w="2494"/>
+            <w:shd w:val="clear" w:color="auto" w:fill="0D5A62"/>
+          </w:tcPr>
+          <w:p>
+            <w:pPr>
+              <w:spacing w:after="0"/>
+            </w:pPr>
+            <w:r>
+              <w:rPr>
+                <w:b/>
+                <w:i w:val="0"/>
+                <w:color w:val="FFFFFF"/>
+                <w:sz w:val="17"/>
+              </w:rPr>
+              <w:t>Expositor</w:t>
+            </w:r>
+          </w:p>
+        </w:tc>
+        <w:tc>
+          <w:tcPr>
+            <w:tcW w:type="dxa" w:w="907"/>
+            <w:shd w:val="clear" w:color="auto" w:fill="0D5A62"/>
+          </w:tcPr>
+          <w:p>
+            <w:pPr>
+              <w:spacing w:after="0"/>
+            </w:pPr>
+            <w:r>
+              <w:rPr>
+                <w:b/>
+                <w:i w:val="0"/>
+                <w:color w:val="FFFFFF"/>
+                <w:sz w:val="17"/>
+              </w:rPr>
+              <w:t>Duración</w:t>
+            </w:r>
+          </w:p>
+        </w:tc>
+      </w:tr>
+      <w:tr>
+        <w:tc>
+          <w:tcPr>
+            <w:tcW w:type="dxa" w:w="907"/>
+          </w:tcPr>
+          <w:p>
+            <w:pPr>
+              <w:spacing w:after="0"/>
+            </w:pPr>
+            <w:r>
+              <w:rPr>
+                <w:b w:val="0"/>
+                <w:i w:val="0"/>
+                <w:color w:val="1A2325"/>
+                <w:sz w:val="17"/>
+              </w:rPr>
+              <w:t>M4 · C1</w:t>
+            </w:r>
+          </w:p>
+        </w:tc>
+        <w:tc>
+          <w:tcPr>
+            <w:tcW w:type="dxa" w:w="4876"/>
+          </w:tcPr>
+          <w:p>
+            <w:pPr>
+              <w:spacing w:after="0"/>
+            </w:pPr>
+            <w:r>
+              <w:rPr>
+                <w:b/>
+                <w:i w:val="0"/>
+                <w:color w:val="1A2325"/>
+                <w:sz w:val="17"/>
+              </w:rPr>
+              <w:t>Fisiopatología y clasificación de la diabetes</w:t>
+            </w:r>
+            <w:r>
+              <w:rPr>
+                <w:b w:val="0"/>
+                <w:i w:val="0"/>
+                <w:color w:val="1A2325"/>
+                <w:sz w:val="17"/>
+              </w:rPr>
+              <w:br/>
+              <w:t>Defectos fisiopatológicos de la DM2; clasificación actual; diagnóstico temprano</w:t>
+            </w:r>
+          </w:p>
+        </w:tc>
+        <w:tc>
+          <w:tcPr>
+            <w:tcW w:type="dxa" w:w="2494"/>
+          </w:tcPr>
+          <w:p>
+            <w:pPr>
+              <w:spacing w:after="0"/>
+            </w:pPr>
+            <w:r>
+              <w:rPr>
+                <w:b w:val="0"/>
+                <w:i w:val="0"/>
+                <w:color w:val="1A2325"/>
+                <w:sz w:val="17"/>
+              </w:rPr>
+              <w:t>Dra. María Paz Castillo Cabrera</w:t>
+            </w:r>
+          </w:p>
+        </w:tc>
+        <w:tc>
+          <w:tcPr>
+            <w:tcW w:type="dxa" w:w="907"/>
+          </w:tcPr>
+          <w:p>
+            <w:pPr>
+              <w:spacing w:after="0"/>
+            </w:pPr>
+            <w:r>
+              <w:rPr>
+                <w:b w:val="0"/>
+                <w:i w:val="0"/>
+                <w:color w:val="1A2325"/>
+                <w:sz w:val="17"/>
+              </w:rPr>
+              <w:t>30 min</w:t>
+            </w:r>
+          </w:p>
+        </w:tc>
+      </w:tr>
+      <w:tr>
+        <w:tc>
+          <w:tcPr>
+            <w:tcW w:type="dxa" w:w="907"/>
+          </w:tcPr>
+          <w:p>
+            <w:pPr>
+              <w:spacing w:after="0"/>
+            </w:pPr>
+            <w:r>
+              <w:rPr>
+                <w:b w:val="0"/>
+                <w:i w:val="0"/>
+                <w:color w:val="1A2325"/>
+                <w:sz w:val="17"/>
+              </w:rPr>
+              <w:t>M4 · C2</w:t>
+            </w:r>
+          </w:p>
+        </w:tc>
+        <w:tc>
+          <w:tcPr>
+            <w:tcW w:type="dxa" w:w="4876"/>
+          </w:tcPr>
+          <w:p>
+            <w:pPr>
+              <w:spacing w:after="0"/>
+            </w:pPr>
+            <w:r>
+              <w:rPr>
+                <w:b/>
+                <w:i w:val="0"/>
+                <w:color w:val="1A2325"/>
+                <w:sz w:val="17"/>
+              </w:rPr>
+              <w:t>Monitoreo glucémico y metas terapéuticas</w:t>
+            </w:r>
+            <w:r>
+              <w:rPr>
+                <w:b w:val="0"/>
+                <w:i w:val="0"/>
+                <w:color w:val="1A2325"/>
+                <w:sz w:val="17"/>
+              </w:rPr>
+              <w:br/>
+              <w:t>HbA1c; tiempo en rango; AGP y monitoreo continuo de glucosa</w:t>
+            </w:r>
+          </w:p>
+        </w:tc>
+        <w:tc>
+          <w:tcPr>
+            <w:tcW w:type="dxa" w:w="2494"/>
+          </w:tcPr>
+          <w:p>
+            <w:pPr>
+              <w:spacing w:after="0"/>
+            </w:pPr>
+            <w:r>
+              <w:rPr>
+                <w:b w:val="0"/>
+                <w:i w:val="0"/>
+                <w:color w:val="1A2325"/>
+                <w:sz w:val="17"/>
+              </w:rPr>
+              <w:t>Dra. Josefa Elizabeth Palacio Riofrío</w:t>
+            </w:r>
+          </w:p>
+        </w:tc>
+        <w:tc>
+          <w:tcPr>
+            <w:tcW w:type="dxa" w:w="907"/>
+          </w:tcPr>
+          <w:p>
+            <w:pPr>
+              <w:spacing w:after="0"/>
+            </w:pPr>
+            <w:r>
+              <w:rPr>
+                <w:b w:val="0"/>
+                <w:i w:val="0"/>
+                <w:color w:val="1A2325"/>
+                <w:sz w:val="17"/>
+              </w:rPr>
+              <w:t>30 min</w:t>
+            </w:r>
+          </w:p>
+        </w:tc>
+      </w:tr>
+      <w:tr>
+        <w:tc>
+          <w:tcPr>
+            <w:tcW w:type="dxa" w:w="907"/>
+          </w:tcPr>
+          <w:p>
+            <w:pPr>
+              <w:spacing w:after="0"/>
+            </w:pPr>
+            <w:r>
+              <w:rPr>
+                <w:b w:val="0"/>
+                <w:i w:val="0"/>
+                <w:color w:val="1A2325"/>
+                <w:sz w:val="17"/>
+              </w:rPr>
+              <w:t>M4 · C3</w:t>
+            </w:r>
+          </w:p>
+        </w:tc>
+        <w:tc>
+          <w:tcPr>
+            <w:tcW w:type="dxa" w:w="4876"/>
+          </w:tcPr>
+          <w:p>
+            <w:pPr>
+              <w:spacing w:after="0"/>
+            </w:pPr>
+            <w:r>
+              <w:rPr>
+                <w:b/>
+                <w:i w:val="0"/>
+                <w:color w:val="1A2325"/>
+                <w:sz w:val="17"/>
+              </w:rPr>
+              <w:t>Terapia farmacológica moderna</w:t>
+            </w:r>
+            <w:r>
+              <w:rPr>
+                <w:b w:val="0"/>
+                <w:i w:val="0"/>
+                <w:color w:val="1A2325"/>
+                <w:sz w:val="17"/>
+              </w:rPr>
+              <w:br/>
+              <w:t>iSGLT2 e iDPP-4; agonistas de GLP-1 y tirzepatida; individualización</w:t>
+            </w:r>
+          </w:p>
+        </w:tc>
+        <w:tc>
+          <w:tcPr>
+            <w:tcW w:type="dxa" w:w="2494"/>
+          </w:tcPr>
+          <w:p>
+            <w:pPr>
+              <w:spacing w:after="0"/>
+            </w:pPr>
+            <w:r>
+              <w:rPr>
+                <w:b w:val="0"/>
+                <w:i w:val="0"/>
+                <w:color w:val="1A2325"/>
+                <w:sz w:val="17"/>
+              </w:rPr>
+              <w:t>Dra. Marcia Gabriela Jiménez Encalada</w:t>
+            </w:r>
+          </w:p>
+        </w:tc>
+        <w:tc>
+          <w:tcPr>
+            <w:tcW w:type="dxa" w:w="907"/>
+          </w:tcPr>
+          <w:p>
+            <w:pPr>
+              <w:spacing w:after="0"/>
+            </w:pPr>
+            <w:r>
+              <w:rPr>
+                <w:b w:val="0"/>
+                <w:i w:val="0"/>
+                <w:color w:val="1A2325"/>
+                <w:sz w:val="17"/>
+              </w:rPr>
+              <w:t>30 min</w:t>
+            </w:r>
+          </w:p>
+        </w:tc>
+      </w:tr>
+      <w:tr>
+        <w:tc>
+          <w:tcPr>
+            <w:tcW w:type="dxa" w:w="907"/>
+          </w:tcPr>
+          <w:p>
+            <w:pPr>
+              <w:spacing w:after="0"/>
+            </w:pPr>
+            <w:r>
+              <w:rPr>
+                <w:b w:val="0"/>
+                <w:i w:val="0"/>
+                <w:color w:val="1A2325"/>
+                <w:sz w:val="17"/>
+              </w:rPr>
+              <w:t>M4 · C4</w:t>
+            </w:r>
+          </w:p>
+        </w:tc>
+        <w:tc>
+          <w:tcPr>
+            <w:tcW w:type="dxa" w:w="4876"/>
+          </w:tcPr>
+          <w:p>
+            <w:pPr>
+              <w:spacing w:after="0"/>
+            </w:pPr>
+            <w:r>
+              <w:rPr>
+                <w:b/>
+                <w:i w:val="0"/>
+                <w:color w:val="1A2325"/>
+                <w:sz w:val="17"/>
+              </w:rPr>
+              <w:t>Insulinoterapia avanzada</w:t>
+            </w:r>
+            <w:r>
+              <w:rPr>
+                <w:b w:val="0"/>
+                <w:i w:val="0"/>
+                <w:color w:val="1A2325"/>
+                <w:sz w:val="17"/>
+              </w:rPr>
+              <w:br/>
+              <w:t>Inicio e intensificación; combinación con agonistas de GLP-1; manejo de hipoglucemia</w:t>
+            </w:r>
+          </w:p>
+        </w:tc>
+        <w:tc>
+          <w:tcPr>
+            <w:tcW w:type="dxa" w:w="2494"/>
+          </w:tcPr>
+          <w:p>
+            <w:pPr>
+              <w:spacing w:after="0"/>
+            </w:pPr>
+            <w:r>
+              <w:rPr>
+                <w:b w:val="0"/>
+                <w:i w:val="0"/>
+                <w:color w:val="1A2325"/>
+                <w:sz w:val="17"/>
+              </w:rPr>
+              <w:t>Dr. Juan Fernando Molina Galarza</w:t>
+            </w:r>
+          </w:p>
+        </w:tc>
+        <w:tc>
+          <w:tcPr>
+            <w:tcW w:type="dxa" w:w="907"/>
+          </w:tcPr>
+          <w:p>
+            <w:pPr>
+              <w:spacing w:after="0"/>
+            </w:pPr>
+            <w:r>
+              <w:rPr>
+                <w:b w:val="0"/>
+                <w:i w:val="0"/>
+                <w:color w:val="1A2325"/>
+                <w:sz w:val="17"/>
+              </w:rPr>
+              <w:t>30 min</w:t>
+            </w:r>
+          </w:p>
+        </w:tc>
+      </w:tr>
+    </w:tbl>
+    <w:p>
+      <w:pPr>
+        <w:spacing w:after="40"/>
+      </w:pPr>
+    </w:p>
+    <w:p>
+      <w:pPr>
+        <w:keepNext/>
+        <w:spacing w:before="120" w:after="40"/>
+      </w:pPr>
+      <w:r>
+        <w:rPr>
+          <w:b/>
+          <w:i w:val="0"/>
+          <w:color w:val="0D5A62"/>
+        </w:rPr>
+        <w:t>Módulo 5 · Terapia nutricional en diabetes y obesidad</w:t>
+      </w:r>
+    </w:p>
+    <w:p>
+      <w:pPr>
+        <w:keepNext/>
+        <w:spacing w:before="0" w:after="60"/>
+      </w:pPr>
+      <w:r>
+        <w:rPr>
+          <w:b w:val="0"/>
+          <w:i/>
+          <w:color w:val="5F7073"/>
+          <w:sz w:val="18"/>
+        </w:rPr>
+        <w:t>Publicación: jueves 17 de diciembre de 2026</w:t>
+      </w:r>
+    </w:p>
+    <w:tbl>
+      <w:tblPr>
+        <w:tblStyle w:val="TableGrid"/>
+        <w:tblW w:type="auto" w:w="0"/>
+        <w:jc w:val="center"/>
+        <w:tblLayout w:type="fixed"/>
+        <w:tblLook w:firstColumn="1" w:firstRow="1" w:lastColumn="0" w:lastRow="0" w:noHBand="0" w:noVBand="1" w:val="04A0"/>
+      </w:tblPr>
+      <w:tblGrid>
+        <w:gridCol w:w="907"/>
+        <w:gridCol w:w="4876"/>
+        <w:gridCol w:w="2494"/>
+        <w:gridCol w:w="907"/>
+      </w:tblGrid>
+      <w:tr>
+        <w:tc>
+          <w:tcPr>
+            <w:tcW w:type="dxa" w:w="907"/>
+            <w:shd w:val="clear" w:color="auto" w:fill="0D5A62"/>
+          </w:tcPr>
+          <w:p>
+            <w:pPr>
+              <w:spacing w:after="0"/>
+            </w:pPr>
+            <w:r>
+              <w:rPr>
+                <w:b/>
+                <w:i w:val="0"/>
+                <w:color w:val="FFFFFF"/>
+                <w:sz w:val="17"/>
+              </w:rPr>
+              <w:t>Clase</w:t>
+            </w:r>
+          </w:p>
+        </w:tc>
+        <w:tc>
+          <w:tcPr>
+            <w:tcW w:type="dxa" w:w="4876"/>
+            <w:shd w:val="clear" w:color="auto" w:fill="0D5A62"/>
+          </w:tcPr>
+          <w:p>
+            <w:pPr>
+              <w:spacing w:after="0"/>
+            </w:pPr>
+            <w:r>
+              <w:rPr>
+                <w:b/>
+                <w:i w:val="0"/>
+                <w:color w:val="FFFFFF"/>
+                <w:sz w:val="17"/>
+              </w:rPr>
+              <w:t>Tema y contenidos</w:t>
+            </w:r>
+          </w:p>
+        </w:tc>
+        <w:tc>
+          <w:tcPr>
+            <w:tcW w:type="dxa" w:w="2494"/>
+            <w:shd w:val="clear" w:color="auto" w:fill="0D5A62"/>
+          </w:tcPr>
+          <w:p>
+            <w:pPr>
+              <w:spacing w:after="0"/>
+            </w:pPr>
+            <w:r>
+              <w:rPr>
+                <w:b/>
+                <w:i w:val="0"/>
+                <w:color w:val="FFFFFF"/>
+                <w:sz w:val="17"/>
+              </w:rPr>
+              <w:t>Expositor</w:t>
+            </w:r>
+          </w:p>
+        </w:tc>
+        <w:tc>
+          <w:tcPr>
+            <w:tcW w:type="dxa" w:w="907"/>
+            <w:shd w:val="clear" w:color="auto" w:fill="0D5A62"/>
+          </w:tcPr>
+          <w:p>
+            <w:pPr>
+              <w:spacing w:after="0"/>
+            </w:pPr>
+            <w:r>
+              <w:rPr>
+                <w:b/>
+                <w:i w:val="0"/>
+                <w:color w:val="FFFFFF"/>
+                <w:sz w:val="17"/>
+              </w:rPr>
+              <w:t>Duración</w:t>
+            </w:r>
+          </w:p>
+        </w:tc>
+      </w:tr>
+      <w:tr>
+        <w:tc>
+          <w:tcPr>
+            <w:tcW w:type="dxa" w:w="907"/>
+          </w:tcPr>
+          <w:p>
+            <w:pPr>
+              <w:spacing w:after="0"/>
+            </w:pPr>
+            <w:r>
+              <w:rPr>
+                <w:b w:val="0"/>
+                <w:i w:val="0"/>
+                <w:color w:val="1A2325"/>
+                <w:sz w:val="17"/>
+              </w:rPr>
+              <w:t>M5 · C1</w:t>
+            </w:r>
+          </w:p>
+        </w:tc>
+        <w:tc>
+          <w:tcPr>
+            <w:tcW w:type="dxa" w:w="4876"/>
+          </w:tcPr>
+          <w:p>
+            <w:pPr>
+              <w:spacing w:after="0"/>
+            </w:pPr>
+            <w:r>
+              <w:rPr>
+                <w:b/>
+                <w:i w:val="0"/>
+                <w:color w:val="1A2325"/>
+                <w:sz w:val="17"/>
+              </w:rPr>
+              <w:t>Nutrición de precisión en diabetes y obesidad: innovación, equidad y desafíos para América Latina y Ecuador</w:t>
+            </w:r>
+            <w:r>
+              <w:rPr>
+                <w:b w:val="0"/>
+                <w:i w:val="0"/>
+                <w:color w:val="1A2325"/>
+                <w:sz w:val="17"/>
+              </w:rPr>
+              <w:br/>
+              <w:t>Fenotipos metabólicos; individualización nutricional</w:t>
+            </w:r>
+          </w:p>
+        </w:tc>
+        <w:tc>
+          <w:tcPr>
+            <w:tcW w:type="dxa" w:w="2494"/>
+          </w:tcPr>
+          <w:p>
+            <w:pPr>
+              <w:spacing w:after="0"/>
+            </w:pPr>
+            <w:r>
+              <w:rPr>
+                <w:b w:val="0"/>
+                <w:i w:val="0"/>
+                <w:color w:val="1A2325"/>
+                <w:sz w:val="17"/>
+              </w:rPr>
+              <w:t>Lcda. Gabriela Estefanía Molina Ochoa, Mgt.</w:t>
+            </w:r>
+          </w:p>
+        </w:tc>
+        <w:tc>
+          <w:tcPr>
+            <w:tcW w:type="dxa" w:w="907"/>
+          </w:tcPr>
+          <w:p>
+            <w:pPr>
+              <w:spacing w:after="0"/>
+            </w:pPr>
+            <w:r>
+              <w:rPr>
+                <w:b w:val="0"/>
+                <w:i w:val="0"/>
+                <w:color w:val="1A2325"/>
+                <w:sz w:val="17"/>
+              </w:rPr>
+              <w:t>30 min</w:t>
+            </w:r>
+          </w:p>
+        </w:tc>
+      </w:tr>
+      <w:tr>
+        <w:tc>
+          <w:tcPr>
+            <w:tcW w:type="dxa" w:w="907"/>
+          </w:tcPr>
+          <w:p>
+            <w:pPr>
+              <w:spacing w:after="0"/>
+            </w:pPr>
+            <w:r>
+              <w:rPr>
+                <w:b w:val="0"/>
+                <w:i w:val="0"/>
+                <w:color w:val="1A2325"/>
+                <w:sz w:val="17"/>
+              </w:rPr>
+              <w:t>M5 · C2</w:t>
+            </w:r>
+          </w:p>
+        </w:tc>
+        <w:tc>
+          <w:tcPr>
+            <w:tcW w:type="dxa" w:w="4876"/>
+          </w:tcPr>
+          <w:p>
+            <w:pPr>
+              <w:spacing w:after="0"/>
+            </w:pPr>
+            <w:r>
+              <w:rPr>
+                <w:b/>
+                <w:i w:val="0"/>
+                <w:color w:val="1A2325"/>
+                <w:sz w:val="17"/>
+              </w:rPr>
+              <w:t>Estrategias nutricionales basadas en evidencia</w:t>
+            </w:r>
+            <w:r>
+              <w:rPr>
+                <w:b w:val="0"/>
+                <w:i w:val="0"/>
+                <w:color w:val="1A2325"/>
+                <w:sz w:val="17"/>
+              </w:rPr>
+              <w:br/>
+              <w:t>Dieta mediterránea; restricción de carbohidratos; ayuno intermitente</w:t>
+            </w:r>
+          </w:p>
+        </w:tc>
+        <w:tc>
+          <w:tcPr>
+            <w:tcW w:type="dxa" w:w="2494"/>
+          </w:tcPr>
+          <w:p>
+            <w:pPr>
+              <w:spacing w:after="0"/>
+            </w:pPr>
+            <w:r>
+              <w:rPr>
+                <w:b w:val="0"/>
+                <w:i w:val="0"/>
+                <w:color w:val="1A2325"/>
+                <w:sz w:val="17"/>
+              </w:rPr>
+              <w:t>Dr. Ramón de Cangas Morán</w:t>
+            </w:r>
+          </w:p>
+        </w:tc>
+        <w:tc>
+          <w:tcPr>
+            <w:tcW w:type="dxa" w:w="907"/>
+          </w:tcPr>
+          <w:p>
+            <w:pPr>
+              <w:spacing w:after="0"/>
+            </w:pPr>
+            <w:r>
+              <w:rPr>
+                <w:b w:val="0"/>
+                <w:i w:val="0"/>
+                <w:color w:val="1A2325"/>
+                <w:sz w:val="17"/>
+              </w:rPr>
+              <w:t>30 min</w:t>
+            </w:r>
+          </w:p>
+        </w:tc>
+      </w:tr>
+      <w:tr>
+        <w:tc>
+          <w:tcPr>
+            <w:tcW w:type="dxa" w:w="907"/>
+          </w:tcPr>
+          <w:p>
+            <w:pPr>
+              <w:spacing w:after="0"/>
+            </w:pPr>
+            <w:r>
+              <w:rPr>
+                <w:b w:val="0"/>
+                <w:i w:val="0"/>
+                <w:color w:val="1A2325"/>
+                <w:sz w:val="17"/>
+              </w:rPr>
+              <w:t>M5 · C3</w:t>
+            </w:r>
+          </w:p>
+        </w:tc>
+        <w:tc>
+          <w:tcPr>
+            <w:tcW w:type="dxa" w:w="4876"/>
+          </w:tcPr>
+          <w:p>
+            <w:pPr>
+              <w:spacing w:after="0"/>
+            </w:pPr>
+            <w:r>
+              <w:rPr>
+                <w:b/>
+                <w:i w:val="0"/>
+                <w:color w:val="1A2325"/>
+                <w:sz w:val="17"/>
+              </w:rPr>
+              <w:t>Nutrición durante las terapias para obesidad</w:t>
+            </w:r>
+            <w:r>
+              <w:rPr>
+                <w:b w:val="0"/>
+                <w:i w:val="0"/>
+                <w:color w:val="1A2325"/>
+                <w:sz w:val="17"/>
+              </w:rPr>
+              <w:br/>
+              <w:t>Agonistas de GLP-1; tirzepatida; preservación de la masa muscular</w:t>
+            </w:r>
+          </w:p>
+        </w:tc>
+        <w:tc>
+          <w:tcPr>
+            <w:tcW w:type="dxa" w:w="2494"/>
+          </w:tcPr>
+          <w:p>
+            <w:pPr>
+              <w:spacing w:after="0"/>
+            </w:pPr>
+            <w:r>
+              <w:rPr>
+                <w:b w:val="0"/>
+                <w:i w:val="0"/>
+                <w:color w:val="1A2325"/>
+                <w:sz w:val="17"/>
+              </w:rPr>
+              <w:t>Dra. María Gabriela Machado Orellana</w:t>
+            </w:r>
+          </w:p>
+        </w:tc>
+        <w:tc>
+          <w:tcPr>
+            <w:tcW w:type="dxa" w:w="907"/>
+          </w:tcPr>
+          <w:p>
+            <w:pPr>
+              <w:spacing w:after="0"/>
+            </w:pPr>
+            <w:r>
+              <w:rPr>
+                <w:b w:val="0"/>
+                <w:i w:val="0"/>
+                <w:color w:val="1A2325"/>
+                <w:sz w:val="17"/>
+              </w:rPr>
+              <w:t>30 min</w:t>
+            </w:r>
+          </w:p>
+        </w:tc>
+      </w:tr>
+      <w:tr>
+        <w:tc>
+          <w:tcPr>
+            <w:tcW w:type="dxa" w:w="907"/>
+          </w:tcPr>
+          <w:p>
+            <w:pPr>
+              <w:spacing w:after="0"/>
+            </w:pPr>
+            <w:r>
+              <w:rPr>
+                <w:b w:val="0"/>
+                <w:i w:val="0"/>
+                <w:color w:val="1A2325"/>
+                <w:sz w:val="17"/>
+              </w:rPr>
+              <w:t>M5 · C4</w:t>
+            </w:r>
+          </w:p>
+        </w:tc>
+        <w:tc>
+          <w:tcPr>
+            <w:tcW w:type="dxa" w:w="4876"/>
+          </w:tcPr>
+          <w:p>
+            <w:pPr>
+              <w:spacing w:after="0"/>
+            </w:pPr>
+            <w:r>
+              <w:rPr>
+                <w:b/>
+                <w:i w:val="0"/>
+                <w:color w:val="1A2325"/>
+                <w:sz w:val="17"/>
+              </w:rPr>
+              <w:t>Composición corporal y sarcopenia en pacientes con diabetes</w:t>
+            </w:r>
+            <w:r>
+              <w:rPr>
+                <w:b w:val="0"/>
+                <w:i w:val="0"/>
+                <w:color w:val="1A2325"/>
+                <w:sz w:val="17"/>
+              </w:rPr>
+              <w:br/>
+              <w:t>Evaluación clínica; interpretación de la bioimpedancia; estrategias nutricionales</w:t>
+            </w:r>
+          </w:p>
+        </w:tc>
+        <w:tc>
+          <w:tcPr>
+            <w:tcW w:type="dxa" w:w="2494"/>
+          </w:tcPr>
+          <w:p>
+            <w:pPr>
+              <w:spacing w:after="0"/>
+            </w:pPr>
+            <w:r>
+              <w:rPr>
+                <w:b w:val="0"/>
+                <w:i w:val="0"/>
+                <w:color w:val="1A2325"/>
+                <w:sz w:val="17"/>
+              </w:rPr>
+              <w:t>Dra. Lizbet Yolanda Ruilova González</w:t>
+            </w:r>
+          </w:p>
+        </w:tc>
+        <w:tc>
+          <w:tcPr>
+            <w:tcW w:type="dxa" w:w="907"/>
+          </w:tcPr>
+          <w:p>
+            <w:pPr>
+              <w:spacing w:after="0"/>
+            </w:pPr>
+            <w:r>
+              <w:rPr>
+                <w:b w:val="0"/>
+                <w:i w:val="0"/>
+                <w:color w:val="1A2325"/>
+                <w:sz w:val="17"/>
+              </w:rPr>
+              <w:t>30 min</w:t>
+            </w:r>
+          </w:p>
+        </w:tc>
+      </w:tr>
+    </w:tbl>
+    <w:p>
+      <w:pPr>
+        <w:spacing w:after="40"/>
+      </w:pPr>
+    </w:p>
+    <w:p>
+      <w:pPr>
+        <w:keepNext/>
+        <w:spacing w:before="120" w:after="40"/>
+      </w:pPr>
+      <w:r>
+        <w:rPr>
+          <w:b/>
+          <w:i w:val="0"/>
+          <w:color w:val="0D5A62"/>
+        </w:rPr>
+        <w:t>Módulo 6 · Complicaciones cardiorrenometabólicas</w:t>
+      </w:r>
+    </w:p>
+    <w:p>
+      <w:pPr>
+        <w:keepNext/>
+        <w:spacing w:before="0" w:after="60"/>
+      </w:pPr>
+      <w:r>
+        <w:rPr>
+          <w:b w:val="0"/>
+          <w:i/>
+          <w:color w:val="5F7073"/>
+          <w:sz w:val="18"/>
+        </w:rPr>
+        <w:t>Publicación: jueves 7 de enero de 2027</w:t>
+      </w:r>
+    </w:p>
+    <w:tbl>
+      <w:tblPr>
+        <w:tblStyle w:val="TableGrid"/>
+        <w:tblW w:type="auto" w:w="0"/>
+        <w:jc w:val="center"/>
+        <w:tblLayout w:type="fixed"/>
+        <w:tblLook w:firstColumn="1" w:firstRow="1" w:lastColumn="0" w:lastRow="0" w:noHBand="0" w:noVBand="1" w:val="04A0"/>
+      </w:tblPr>
+      <w:tblGrid>
+        <w:gridCol w:w="907"/>
+        <w:gridCol w:w="4876"/>
+        <w:gridCol w:w="2494"/>
+        <w:gridCol w:w="907"/>
+      </w:tblGrid>
+      <w:tr>
+        <w:tc>
+          <w:tcPr>
+            <w:tcW w:type="dxa" w:w="907"/>
+            <w:shd w:val="clear" w:color="auto" w:fill="0D5A62"/>
+          </w:tcPr>
+          <w:p>
+            <w:pPr>
+              <w:spacing w:after="0"/>
+            </w:pPr>
+            <w:r>
+              <w:rPr>
+                <w:b/>
+                <w:i w:val="0"/>
+                <w:color w:val="FFFFFF"/>
+                <w:sz w:val="17"/>
+              </w:rPr>
+              <w:t>Clase</w:t>
+            </w:r>
+          </w:p>
+        </w:tc>
+        <w:tc>
+          <w:tcPr>
+            <w:tcW w:type="dxa" w:w="4876"/>
+            <w:shd w:val="clear" w:color="auto" w:fill="0D5A62"/>
+          </w:tcPr>
+          <w:p>
+            <w:pPr>
+              <w:spacing w:after="0"/>
+            </w:pPr>
+            <w:r>
+              <w:rPr>
+                <w:b/>
+                <w:i w:val="0"/>
+                <w:color w:val="FFFFFF"/>
+                <w:sz w:val="17"/>
+              </w:rPr>
+              <w:t>Tema y contenidos</w:t>
+            </w:r>
+          </w:p>
+        </w:tc>
+        <w:tc>
+          <w:tcPr>
+            <w:tcW w:type="dxa" w:w="2494"/>
+            <w:shd w:val="clear" w:color="auto" w:fill="0D5A62"/>
+          </w:tcPr>
+          <w:p>
+            <w:pPr>
+              <w:spacing w:after="0"/>
+            </w:pPr>
+            <w:r>
+              <w:rPr>
+                <w:b/>
+                <w:i w:val="0"/>
+                <w:color w:val="FFFFFF"/>
+                <w:sz w:val="17"/>
+              </w:rPr>
+              <w:t>Expositor</w:t>
+            </w:r>
+          </w:p>
+        </w:tc>
+        <w:tc>
+          <w:tcPr>
+            <w:tcW w:type="dxa" w:w="907"/>
+            <w:shd w:val="clear" w:color="auto" w:fill="0D5A62"/>
+          </w:tcPr>
+          <w:p>
+            <w:pPr>
+              <w:spacing w:after="0"/>
+            </w:pPr>
+            <w:r>
+              <w:rPr>
+                <w:b/>
+                <w:i w:val="0"/>
+                <w:color w:val="FFFFFF"/>
+                <w:sz w:val="17"/>
+              </w:rPr>
+              <w:t>Duración</w:t>
+            </w:r>
+          </w:p>
+        </w:tc>
+      </w:tr>
+      <w:tr>
+        <w:tc>
+          <w:tcPr>
+            <w:tcW w:type="dxa" w:w="907"/>
+          </w:tcPr>
+          <w:p>
+            <w:pPr>
+              <w:spacing w:after="0"/>
+            </w:pPr>
+            <w:r>
+              <w:rPr>
+                <w:b w:val="0"/>
+                <w:i w:val="0"/>
+                <w:color w:val="1A2325"/>
+                <w:sz w:val="17"/>
+              </w:rPr>
               <w:t>M6 · C1</w:t>
             </w:r>
           </w:p>
@@ -3982,7 +3982,7 @@
           <w:color w:val="5F7073"/>
           <w:sz w:val="18"/>
         </w:rPr>
-        <w:t>Publicación: jueves 10 de diciembre de 2026</w:t>
+        <w:t>Publicación: jueves 14 de enero de 2027</w:t>
       </w:r>
     </w:p>
     <w:tbl>
@@ -4564,7 +4564,7 @@
                 <w:color w:val="1A2325"/>
                 <w:sz w:val="18"/>
               </w:rPr>
-              <w:t>jueves 5 de noviembre</w:t>
+              <w:t>jueves 26 de noviembre de 2026</w:t>
             </w:r>
           </w:p>
         </w:tc>
@@ -4623,7 +4623,7 @@
                 <w:color w:val="1A2325"/>
                 <w:sz w:val="18"/>
               </w:rPr>
-              <w:t>jueves 12 de noviembre</w:t>
+              <w:t>jueves 3 de diciembre de 2026</w:t>
             </w:r>
           </w:p>
         </w:tc>
@@ -4682,7 +4682,7 @@
                 <w:color w:val="1A2325"/>
                 <w:sz w:val="18"/>
               </w:rPr>
-              <w:t>jueves 19 de noviembre</w:t>
+              <w:t>jueves 10 de diciembre de 2026</w:t>
             </w:r>
           </w:p>
         </w:tc>
@@ -4741,7 +4741,7 @@
                 <w:color w:val="1A2325"/>
                 <w:sz w:val="18"/>
               </w:rPr>
-              <w:t>jueves 26 de noviembre</w:t>
+              <w:t>jueves 17 de diciembre de 2026</w:t>
             </w:r>
           </w:p>
         </w:tc>
@@ -4781,7 +4781,7 @@
                 <w:color w:val="1A2325"/>
                 <w:sz w:val="18"/>
               </w:rPr>
-              <w:t>5</w:t>
+              <w:t>—</w:t>
             </w:r>
           </w:p>
         </w:tc>
@@ -4800,7 +4800,7 @@
                 <w:color w:val="1A2325"/>
                 <w:sz w:val="18"/>
               </w:rPr>
-              <w:t>jueves 3 de diciembre</w:t>
+              <w:t>18 de diciembre – 6 de enero</w:t>
             </w:r>
           </w:p>
         </w:tc>
@@ -4819,7 +4819,7 @@
                 <w:color w:val="1A2325"/>
                 <w:sz w:val="18"/>
               </w:rPr>
-              <w:t>Módulo 6</w:t>
+              <w:t>Receso por las fiestas de fin de año</w:t>
             </w:r>
           </w:p>
         </w:tc>
@@ -4840,7 +4840,7 @@
                 <w:color w:val="1A2325"/>
                 <w:sz w:val="18"/>
               </w:rPr>
-              <w:t>6</w:t>
+              <w:t>5</w:t>
             </w:r>
           </w:p>
         </w:tc>
@@ -4859,7 +4859,7 @@
                 <w:color w:val="1A2325"/>
                 <w:sz w:val="18"/>
               </w:rPr>
-              <w:t>jueves 10 de diciembre</w:t>
+              <w:t>jueves 7 de enero de 2027</w:t>
             </w:r>
           </w:p>
         </w:tc>
@@ -4878,7 +4878,7 @@
                 <w:color w:val="1A2325"/>
                 <w:sz w:val="18"/>
               </w:rPr>
-              <w:t>Módulo 7</w:t>
+              <w:t>Módulo 6</w:t>
             </w:r>
           </w:p>
         </w:tc>
@@ -4899,7 +4899,7 @@
                 <w:color w:val="1A2325"/>
                 <w:sz w:val="18"/>
               </w:rPr>
-              <w:t>7</w:t>
+              <w:t>6</w:t>
             </w:r>
           </w:p>
         </w:tc>
@@ -4918,7 +4918,66 @@
                 <w:color w:val="1A2325"/>
                 <w:sz w:val="18"/>
               </w:rPr>
-              <w:t>jueves 17 de diciembre</w:t>
+              <w:t>jueves 14 de enero de 2027</w:t>
+            </w:r>
+          </w:p>
+        </w:tc>
+        <w:tc>
+          <w:tcPr>
+            <w:tcW w:type="dxa" w:w="5216"/>
+          </w:tcPr>
+          <w:p>
+            <w:pPr>
+              <w:spacing w:after="0"/>
+            </w:pPr>
+            <w:r>
+              <w:rPr>
+                <w:b w:val="0"/>
+                <w:i w:val="0"/>
+                <w:color w:val="1A2325"/>
+                <w:sz w:val="18"/>
+              </w:rPr>
+              <w:t>Módulo 7</w:t>
+            </w:r>
+          </w:p>
+        </w:tc>
+      </w:tr>
+      <w:tr>
+        <w:tc>
+          <w:tcPr>
+            <w:tcW w:type="dxa" w:w="1134"/>
+          </w:tcPr>
+          <w:p>
+            <w:pPr>
+              <w:spacing w:after="0"/>
+            </w:pPr>
+            <w:r>
+              <w:rPr>
+                <w:b w:val="0"/>
+                <w:i w:val="0"/>
+                <w:color w:val="1A2325"/>
+                <w:sz w:val="18"/>
+              </w:rPr>
+              <w:t>7</w:t>
+            </w:r>
+          </w:p>
+        </w:tc>
+        <w:tc>
+          <w:tcPr>
+            <w:tcW w:type="dxa" w:w="2835"/>
+          </w:tcPr>
+          <w:p>
+            <w:pPr>
+              <w:spacing w:after="0"/>
+            </w:pPr>
+            <w:r>
+              <w:rPr>
+                <w:b w:val="0"/>
+                <w:i w:val="0"/>
+                <w:color w:val="1A2325"/>
+                <w:sz w:val="18"/>
+              </w:rPr>
+              <w:t>jueves 21 de enero de 2027</w:t>
             </w:r>
           </w:p>
         </w:tc>

</xml_diff>